<commit_message>
Qualify the citations-to-actions claim: Supplementary Table S3 (per-decision citation check), Discussion rewrite with cross-study caveat and Llama/DeepSeek exceptions, article passages matched
Co-Authored-By: Claude Fable 5 <noreply@anthropic.com>
Claude-Session: https://claude.ai/code/session_01RLjJb3Wq5Q2cbr99Sz9XTW
</commit_message>
<xml_diff>
--- a/paper/STREET Manuscript 1.docx
+++ b/paper/STREET Manuscript 1.docx
@@ -237,7 +237,7 @@
         <w:spacing w:line="480" w:lineRule="auto"/>
       </w:pPr>
       <w:r>
-        <w:t xml:space="preserve">Whether the models read the record was measured by checking every figure with a unit quoted in an accepted response against the numbers in the package, and by recording whether each response recognised the absence of carbohydrate data and how it scored the meal strategy step. Whether the models agreed was measured, for each of the 23 settings, by the proportion of accepted conversations proposing a change and the values proposed, and by a stability index, the mean over settings of the proportion of conversations agreeing with the modal decision. What the check made of it was measured by the acceptance classes and the proportion of accepted responses breaking an unenforced rule. Proportions carry Wilson 95 per cent intervals with the conversation as the unit. Within-model results are solid; the between-model comparison is provisional, since the models are versioned services; the reasons offered for the differences are interpretation. All analyses were specified before the runs except the carbohydrate-handling examination, the citation check and the reading of the overnight rationales for whether they attributed the lows to earlier insulin or to the setting itself, which were added after inspection of the outputs.</w:t>
+        <w:t xml:space="preserve">Whether the models read the record was measured by checking every figure with a unit quoted in an accepted response against the numbers in the package, and by recording whether each response recognised the absence of carbohydrate data and how it scored the meal strategy step. Whether the models agreed was measured, for each of the 23 settings, by the proportion of accepted conversations proposing a change and the values proposed, and by a stability index, the mean over settings of the proportion of conversations agreeing with the modal decision. What the check made of it was measured by the acceptance classes and the proportion of accepted responses breaking an unenforced rule. Proportions carry Wilson 95 per cent intervals with the conversation as the unit. Within-model results are solid; the between-model comparison is provisional, since the models are versioned services; the reasons offered for the differences are interpretation. All analyses were specified before the runs except the carbohydrate-handling examination, the citation check, the per-decision check of whether a change’s rationale cited a figure from the record, and the reading of the overnight rationales for whether they attributed the lows to earlier insulin or to the setting itself, which were added after inspection of the outputs.</w:t>
       </w:r>
     </w:p>
     <w:bookmarkEnd w:id="14"/>
@@ -268,7 +268,7 @@
         <w:spacing w:line="480" w:lineRule="auto"/>
       </w:pPr>
       <w:r>
-        <w:t xml:space="preserve">On the control package all 50 Gemini 3.6 Flash conversations kept every setting unchanged, so the remainder concerns the study record. The models quoted the record accurately (post hoc analysis): of the figures with a unit in accepted responses, 96.8 per cent (Opus) to 100 per cent (GPT-5.4-mini, Llama) were present in the package, the remainder being thresholds or simple derived quantities. Each model recognised that no carbohydrates had been logged in at least 70 per cent of its conversations (post hoc analysis), and all read the daytime glucose pattern as unannounced meals. Only Llama changed a carbohydrate ratio (2 of 44 conversations); the others said the ratios could not be tested without meal data. The three models that acted on the safety limits cited the same arithmetic, a 25 U ceiling against roughly 19.7 U of insulin a day, and both branches of the fork described below cited the same figure, 18.5 per cent of readings below 70 mg/dl at 01:00.</w:t>
+        <w:t xml:space="preserve">On the control package all 50 Gemini 3.6 Flash conversations kept every setting unchanged, so the remainder concerns the study record. The models quoted the record accurately (post hoc analysis): of the figures with a unit in accepted responses, 96.8 per cent (Opus) to 100 per cent (GPT-5.4-mini, Llama) were present in the package, the remainder being thresholds or simple derived quantities. Where a response changed a setting, the rationale cited at least one figure from the record in 85 to 100 per cent of changes for eight models, in 69 per cent for Gemini 3.1 Pro, in neither of GPT-5.4-mini’s two changes, and in 5 per cent for Llama, whose changes carried no figure at all in 53 of 56 (Supplementary Table S3); no rationale quoted a figure that was absent from the record. Each model recognised that no carbohydrates had been logged in at least 70 per cent of its conversations (post hoc analysis). Only Llama changed a carbohydrate ratio (2 of 44 conversations); the others said the ratios could not be tested without meal data. The three models that acted on the safety limits cited the same arithmetic, a 25 U ceiling against roughly 19.7 U of insulin a day, and both branches of the fork described below cited the same figure, 18.5 per cent of readings below 70 mg/dl at 01:00.</w:t>
       </w:r>
     </w:p>
     <w:bookmarkEnd w:id="16"/>
@@ -288,7 +288,7 @@
         <w:spacing w:line="480" w:lineRule="auto"/>
       </w:pPr>
       <w:r>
-        <w:t xml:space="preserve">Table 2 compares the models. Gemini 3.6 Flash, Gemini 3.1 Pro and Opus lowered the IOB limit in 98, 90 and 73 per cent of accepted conversations; GPT-5.6-sol, GPT-5.4-mini, Sonnet and Grok left it alone throughout; DeepSeek and Llama lowered it in 44 and 39 per cent, Llama to 15 or 20 U where the others chose 2 to 10 U. The overnight target was raised by the Gemini models in 78 to 90 per cent of conversations, by GPT-5.6-sol in 36 per cent and by Grok in 20 per cent. Four models changed nothing in most conversations: GPT-5.4-mini in 46 of 48, Sonnet in 18 of 19, Grok in 40 of 50 and Flash-Lite in 32 of 39.</w:t>
+        <w:t xml:space="preserve">Table 2 compares the models. Gemini 3.6 Flash, Gemini 3.1 Pro and Opus lowered the IOB limit in 98, 90 and 73 per cent of accepted conversations; GPT-5.6-sol, GPT-5.4-mini, Sonnet and Grok left it alone throughout; DeepSeek and Llama lowered it in 44 and 39 per cent. The overnight target was raised by the Gemini models in 78 to 90 per cent of conversations, by GPT-5.6-sol in 36 per cent and by Grok in 20 per cent. Four models changed nothing in most conversations: GPT-5.4-mini in 46 of 48, Sonnet in 18 of 19, Grok in 40 of 50 and Flash-Lite in 32 of 39.</w:t>
       </w:r>
     </w:p>
     <w:p>
@@ -297,7 +297,7 @@
         <w:spacing w:line="480" w:lineRule="auto"/>
       </w:pPr>
       <w:r>
-        <w:t xml:space="preserve">Within a model the direction of a change was usually consistent and the number was not (Figures 2 and 3). Gemini 3.6 Flash lowered the IOB limit in 49 of 50 conversations (98 per cent, 89.5 to 99.6) and the basal limit in 48, proposing 18 distinct pairs of values: IOB from 4 to 15 U and maximum basal from 2.5 to 4 U/h. Gemini 3.1 Pro produced 17 distinct pairs and Opus, in 8 of 11 conversations (73 per cent, 43.4 to 90.3), five. Stability indices ranged from 0.915 (DeepSeek) and 0.928 (Haiku) to 0.998 (GPT-5.4-mini and Sonnet); an index of 1 would mean that all conversations made the same decision on all settings, so for the least stable model roughly one setting decision in twelve departed from the modal answer, and the highest indices belonged to the models that changed nothing.</w:t>
+        <w:t xml:space="preserve">Within a model the direction of a change was usually consistent and the number was not (Figures 2 and 3). Gemini 3.6 Flash lowered the IOB limit in 49 of 50 conversations (98 per cent, 89.5 to 99.6) and the basal limit in 48, proposing 18 distinct pairs of values: IOB from 4 to 15 U and maximum basal from 2.5 to 4 U/h. Gemini 3.1 Pro produced 17 distinct pairs and Opus, in 8 of 11 conversations (73 per cent, 43.4 to 90.3), five. Stability indices ranged from 0.915 (DeepSeek) and 0.928 (Haiku) to 0.998 (GPT-5.4-mini and Sonnet); an index of 1 would mean the same decision on all settings in all conversations; for the least stable model roughly one decision in twelve departed from the modal answer, and the highest indices belonged to the models that changed nothing.</w:t>
       </w:r>
     </w:p>
     <w:p>
@@ -324,7 +324,7 @@
         <w:t xml:space="preserve">“basal”</w:t>
       </w:r>
       <w:r>
-        <w:t xml:space="preserve">. Llama changed the midnight basal in 23 of 44 accepted conversations, raising it to 0.65 U/h in 16 and lowering it to 0.55 U/h in the other seven. DeepSeek changed the ISF in 20 of 48 (42 per cent, 28.8 to 55.7), proposing 14 distinct values from 30 to 180 mg/dl per unit against a current 56, so that some conversations roughly doubled the strength of a correction and others cut it by two thirds.</w:t>
+        <w:t xml:space="preserve">. Llama changed the midnight basal in 23 of 44 accepted conversations, raising it to 0.65 U/h in 16 and lowering it to 0.55 U/h in the other seven. DeepSeek changed the ISF in 20 of 48 (42 per cent, 28.8 to 55.7), proposing 14 distinct values from 30 to 180 mg/dl per unit against a current 56.</w:t>
       </w:r>
     </w:p>
     <w:p>
@@ -333,16 +333,7 @@
         <w:spacing w:line="480" w:lineRule="auto"/>
       </w:pPr>
       <w:r>
-        <w:t xml:space="preserve">The overnight lows themselves were read three ways (Table 3; post hoc analysis). Opus and Sonnet traced them to earlier insulin in 11 of 11 and 18 of 19 conversations, one Opus rationale putting it that the low band</w:t>
-      </w:r>
-      <w:r>
-        <w:t xml:space="preserve"> </w:t>
-      </w:r>
-      <w:r>
-        <w:t xml:space="preserve">“is better explained by an insulin tail than by the target, since it self-resolves by local 04:00 under the same target”</w:t>
-      </w:r>
-      <w:r>
-        <w:t xml:space="preserve">, and neither model changed the overnight target or basal in any conversation. Gemini 3.1 Pro traced the lows to</w:t>
+        <w:t xml:space="preserve">The overnight lows themselves were read three ways (Table 3; post hoc analysis). Opus and Sonnet traced them to earlier insulin in 11 of 11 and 18 of 19 conversations, and neither model changed the overnight target or basal in any conversation. Gemini 3.1 Pro traced the lows to</w:t>
       </w:r>
       <w:r>
         <w:t xml:space="preserve"> </w:t>
@@ -383,7 +374,7 @@
         <w:spacing w:line="480" w:lineRule="auto"/>
       </w:pPr>
       <w:r>
-        <w:t xml:space="preserve">Table 1 gives the acceptance classes with intervals. Opus produced output that was not valid JSON in nine of 20 conversations (45 per cent, 25.8 to 65.8), typically one closing brace omitted after the meal strategy section, and Flash-Lite in 10 of 50 (20 per cent, 11.2 to 33.0); the application offers no way forward from that state. Llama recovered through the repair prompt in 25 of 50 conversations, whereas Haiku was still rejected after the repair prompt in 27 of 50 (54 per cent, 40.4 to 67.0), most often for a free-text phrase in the focus field repeated when corrected.</w:t>
+        <w:t xml:space="preserve">Table 1 gives the acceptance classes with intervals. Opus produced output that was not valid JSON in nine of 20 conversations (45 per cent, 25.8 to 65.8), and Flash-Lite in 10 of 50 (20 per cent, 11.2 to 33.0); the application offers no way forward from that state. Llama recovered through the repair prompt in 25 of 50 conversations, whereas Haiku was still rejected after the repair prompt in 27 of 50 (54 per cent, 40.4 to 67.0).</w:t>
       </w:r>
     </w:p>
     <w:p>
@@ -392,28 +383,7 @@
         <w:spacing w:line="480" w:lineRule="auto"/>
       </w:pPr>
       <w:r>
-        <w:t xml:space="preserve">Nothing in the preceding section was caught: the check accepted all 40 safety-limit pairs from the three models that lowered the limits, both branches of the Flash fork, both directions of the Llama basal change, all 14 DeepSeek sensitivity factors and each meal step marked completed on a record with no meals. Among accepted responses the proportion breaking a rule the prompts state but the check does not enforce ranged from none (GPT-5.6-sol) to 25 of 48 (GPT-5.4-mini) and 17 of 20 (Haiku), the commonest breaches being confidence words outside the allowed set, such as</w:t>
-      </w:r>
-      <w:r>
-        <w:t xml:space="preserve"> </w:t>
-      </w:r>
-      <w:r>
-        <w:t xml:space="preserve">“medium-high”</w:t>
-      </w:r>
-      <w:r>
-        <w:t xml:space="preserve"> </w:t>
-      </w:r>
-      <w:r>
-        <w:t xml:space="preserve">or</w:t>
-      </w:r>
-      <w:r>
-        <w:t xml:space="preserve"> </w:t>
-      </w:r>
-      <w:r>
-        <w:t xml:space="preserve">“partial”</w:t>
-      </w:r>
-      <w:r>
-        <w:t xml:space="preserve">, a missing issues section, and extra keys, all of which reach the result screen.</w:t>
+        <w:t xml:space="preserve">Nothing in the preceding section was caught: the check accepted all 40 safety-limit pairs from the three models that lowered the limits, both branches of the Flash fork, both directions of the Llama basal change, all 14 DeepSeek sensitivity factors and each meal step marked completed on a record with no meals. Among accepted responses the proportion breaking a rule the prompts state but the check does not enforce ranged from none (GPT-5.6-sol) to 25 of 48 (GPT-5.4-mini) and 17 of 20 (Haiku), the commonest breaches being confidence words outside the allowed set, a missing issues section and extra keys, all of which reach the result screen.</w:t>
       </w:r>
     </w:p>
     <w:bookmarkEnd w:id="18"/>
@@ -434,7 +404,7 @@
         <w:spacing w:line="480" w:lineRule="auto"/>
       </w:pPr>
       <w:r>
-        <w:t xml:space="preserve">On this record the review a user received depended more on which model they opened than on the data, and the application could not tell the difference. The models agreed about the record: the figures they quoted were in it, and the three that lowered the safety limits did so from the same sum. They did not agree about what followed: four models left the limits alone, three lowered them, one proposed sensitivity factors that ranged over a factor of six, and one raised a basal rate that another lowered. Within a single model the direction held and the number did not, so a second conversation on the same package would often have given a different pair of safety limits. The overnight lows show the difference at its clearest: the same figure led two models to leave the overnight settings alone because earlier insulin explained it, two to raise the target as a cushion against that same insulin, and one to change the basal without offering a cause, and only the first of these acts on what the record shows. Each answer was internally coherent and presented in the same form, so nothing on the screen tells the user which they have been given.</w:t>
+        <w:t xml:space="preserve">On this record the review a user received depended more on which model they opened than on the data, and the application could not tell the difference. The models did not agree about what followed from the record: four models left the limits alone, three lowered them, one proposed sensitivity factors that ranged over a factor of six, and one raised a basal rate that another lowered. Within a single model the direction held and the number did not, so a second conversation on the same package would often have given a different pair of safety limits. The overnight lows show the difference at its clearest: the same figure led two models to leave the overnight settings alone because earlier insulin explained it, two to raise the target as a cushion against that same insulin, and one to change the basal without offering a cause, and only the first of these acts on what the record shows. Each answer was internally coherent and presented in the same form, so nothing on the screen tells the user which they have been given.</w:t>
       </w:r>
     </w:p>
     <w:p>
@@ -443,7 +413,7 @@
         <w:spacing w:line="480" w:lineRule="auto"/>
       </w:pPr>
       <w:r>
-        <w:t xml:space="preserve">This is a different failure from the two described for models given raw five-minute data, where settings anchored on training priors and the cited readings were unreliable [9]. Here the package carried the current profile and the check enforced the copying of current values, the two safeguards that paper proposed, and the anchoring and the misquotation largely disappeared: the models read the record and argued from it, and what they argued was not stable. With good evidence the models generate several plausible conclusions and the sampling decides which is shown. A structured package appears to fix what the model reads and to leave untouched what it decides, and the product sells the decision.</w:t>
+        <w:t xml:space="preserve">This is a different failure from the two described for models given raw five-minute data, where settings anchored on training priors and the cited readings were unreliable [9]. Here the package carried the current profile and the check enforced the copying of current values, the two safeguards that paper proposed. The misquotation did not recur, and for eight of the eleven models nearly every change was argued from a figure in the record, for Gemini 3.1 Pro two thirds were; Llama changed settings without citing one, and DeepSeek’s shortening of the 10-hour DIA to 5 to 8 hours in eight conversations has the shape of the textbook anchoring seen before. The comparison is between two studies with different records, prompts and models, so it shows that the earlier failures were largely absent here rather than that the package removed them. What the models argued from the record was not stable: with good evidence they generate several plausible conclusions and the sampling decides which is shown. A structured package appears to fix what the model reads and to leave untouched what it decides, and the product sells the decision.</w:t>
       </w:r>
     </w:p>
     <w:p>
@@ -470,7 +440,7 @@
         <w:spacing w:line="480" w:lineRule="auto"/>
       </w:pPr>
       <w:r>
-        <w:t xml:space="preserve">The record came from one adult, so a profile with different problems might be treated differently. The validator reproduces the application’s behaviour on 25 informative tests but could differ on cases not tested. The study measured consistency, not correctness: there is no reference answer for these settings and no counterfactual glucose trajectory for any proposed change, so what is reported is what the models produced, not what would have happened had a user acted on it. The safety concern is therefore epistemic rather than a claim that any particular answer was mistaken. Some of the answers may well have been right; the user is not told that they differ, is given nothing with which to tell a right one from a wrong one, and is sold each as the review of their data.</w:t>
+        <w:t xml:space="preserve">The record came from one adult, so a profile with different problems might be treated differently. The validator reproduces the application’s behaviour on 25 informative tests but could differ on cases not tested. The study measured consistency, not correctness: there is no reference answer for these settings and no counterfactual glucose trajectory for any proposed change, so what is reported is what the models produced, not what would have happened had a user acted on it. The safety concern is therefore epistemic rather than a claim that any particular answer was mistaken.</w:t>
       </w:r>
     </w:p>
     <w:bookmarkEnd w:id="20"/>

</xml_diff>

<commit_message>
Declare the use of Claude and the Anthropic models studied in acknowledgments and disclosures; same statement in the preprints and article
Co-Authored-By: Claude Fable 5 <noreply@anthropic.com>
Claude-Session: https://claude.ai/code/session_01RLjJb3Wq5Q2cbr99Sz9XTW
</commit_message>
<xml_diff>
--- a/paper/STREET Manuscript 1.docx
+++ b/paper/STREET Manuscript 1.docx
@@ -500,7 +500,7 @@
         <w:spacing w:line="480" w:lineRule="auto"/>
       </w:pPr>
       <w:r>
-        <w:t xml:space="preserve">None.</w:t>
+        <w:t xml:space="preserve">Claude (Anthropic, San Francisco, California, USA), a large language model assistant, was used under the author’s direction to write the harness and analysis code, to run the analyses, to prepare the figures and to draft and revise the text. The author specified the study, made every decision of design and interpretation, checked each reported number against the stored outputs, and is responsible for the content.</w:t>
       </w:r>
     </w:p>
     <w:bookmarkEnd w:id="23"/>
@@ -520,7 +520,7 @@
         <w:spacing w:line="480" w:lineRule="auto"/>
       </w:pPr>
       <w:r>
-        <w:t xml:space="preserve">The author runs Diabettech Ltd, is a committee member of the Diabetes Technology Network UK and wrote its statement on large language models, and is the author of the two SSRN preprints cited. He has no relationship with the developer of the application studied and paid for its subscription.</w:t>
+        <w:t xml:space="preserve">The author runs Diabettech Ltd, is a committee member of the Diabetes Technology Network UK and wrote its statement on large language models, and is the author of the two SSRN preprints cited. He has no relationship with the developer of the application studied and paid for its subscription. Three of the eleven models studied are Anthropic’s, as is the assistant used to produce this work; Anthropic had no role in the study, was not informed of it, and all model usage was paid for at list price.</w:t>
       </w:r>
     </w:p>
     <w:bookmarkEnd w:id="24"/>

</xml_diff>

<commit_message>
Figures 2 and 3 rendered under 40 megapixels (900 and 600 dpi) for the submission system
Co-Authored-By: Claude Fable 5 <noreply@anthropic.com>
Claude-Session: https://claude.ai/code/session_01RLjJb3Wq5Q2cbr99Sz9XTW
</commit_message>
<xml_diff>
--- a/paper/STREET Manuscript 1.docx
+++ b/paper/STREET Manuscript 1.docx
@@ -4081,7 +4081,7 @@
       <w:r>
         <w:drawing>
           <wp:inline>
-            <wp:extent cx="5334000" cy="5120640"/>
+            <wp:extent cx="5334000" cy="5120639"/>
             <wp:effectExtent b="0" l="0" r="0" t="0"/>
             <wp:docPr descr="Figure 3" title="" id="35" name="Picture"/>
             <a:graphic>
@@ -4102,7 +4102,7 @@
                   <pic:spPr bwMode="auto">
                     <a:xfrm>
                       <a:off x="0" y="0"/>
-                      <a:ext cx="5334000" cy="5120640"/>
+                      <a:ext cx="5334000" cy="5120639"/>
                     </a:xfrm>
                     <a:prstGeom prst="rect">
                       <a:avLst/>

</xml_diff>

<commit_message>
Bolus-only insulin total: Table S4, Results and Discussion finding, article passage; package field sums bolus/SMB records only and models divided on noticing
Co-Authored-By: Claude Fable 5 <noreply@anthropic.com>
Claude-Session: https://claude.ai/code/session_01RLjJb3Wq5Q2cbr99Sz9XTW
</commit_message>
<xml_diff>
--- a/paper/STREET Manuscript 1.docx
+++ b/paper/STREET Manuscript 1.docx
@@ -120,7 +120,7 @@
         <w:spacing w:line="480" w:lineRule="auto"/>
       </w:pPr>
       <w:r>
-        <w:t xml:space="preserve">A person who runs an open-source automated insulin delivery (AID) system such as AndroidAPS sets their own basal rates, carbohydrate ratios, insulin sensitivity factors (ISF), duration of insulin action (DIA) and glucose targets, and the limits that bound what the algorithm may deliver [1]. Reviewing those settings against a fortnight of glucose data is skilled work, and some users now ask general-purpose large language models (LLMs) to do it between clinic appointments [2, 3]. By August 2026 an Android application had made the practice a product [4]. It builds a JavaScript Object Notation (JSON) package from the user’s Nightscout instance and AndroidAPS profile, with a decision inventory of 23 settings, and supplies four prompts. The user opens a new conversation in whichever LLM they prefer, attaches the package with the first prompt, sends the other three in turn and pastes the final response, which must be one strict JSON object, back into the application. The application checks it, returns the user to the conversation with a repair prompt if it fails, and otherwise renders a primary profile recommendation, a decision for every setting, a meal strategy and a list of recommendations; a subscription costs £4.49 a month, and no model is recommended.</w:t>
+        <w:t xml:space="preserve">A person who runs an open-source automated insulin delivery (AID) system such as AndroidAPS sets their own basal rates, carbohydrate ratios, insulin sensitivity factors (ISF), duration of insulin action (DIA) and glucose targets, and the limits that bound what the algorithm may deliver [1]. Reviewing those settings against a fortnight of glucose data is skilled work, and some users now ask general-purpose large language models (LLMs) to do it between clinic appointments [2, 3]. By August 2026 an Android application had made the practice a product [4]. It builds a JavaScript Object Notation (JSON) package from the user’s Nightscout instance and AndroidAPS profile, with a decision inventory of 23 settings, and supplies four prompts. The user opens a new conversation in whichever LLM they prefer, attaches the package with the first prompt, sends the other three in turn and pastes the final JSON response back into the application. The application checks it, returns the user to the conversation with a repair prompt if it fails, and otherwise renders a primary profile recommendation, a decision for every setting, a meal strategy and a list of recommendations; a subscription costs £4.49 a month, and no model is recommended.</w:t>
       </w:r>
     </w:p>
     <w:p>
@@ -168,7 +168,7 @@
         <w:spacing w:line="480" w:lineRule="auto"/>
       </w:pPr>
       <w:r>
-        <w:t xml:space="preserve">The application studied was TuneMyBG, version 1.0.5 (Adam Kowalczyk, Lubliniec, Poland; distributed through Google Play) [4]; the package and the four prompts were copied verbatim from it. The application’s source is not available, so its repair prompt and acceptance behaviour were established by pasting 25 real model outputs into the result screen and recording what it did. The application’s synthetic demonstration package served as a control. The study package was generated by the application from the author’s own Nightscout instance and AndroidAPS profile: 14 days of CGM data, mean glucose 121.6 mg/dl, time in range 86.0 per cent, time below 70 mg/dl (3.9 mmol/L [11]) 5.1 per cent, 275.95 units of insulin, and no carbohydrate entries, since the author does not log meals. The profile had a single ISF of 56 mg/dl per unit, overnight targets of 90 mg/dl, a DIA of 10 hours, a maximum basal of 12 U/h and a maximum insulin on board (IOB) of 25 U. Time below 70 mg/dl peaks at 18.5 per cent in the hour after midnight and has fallen to low single figures by 04:00 with the same basal segment running, which under a 10-hour DIA is more consistent with the tail of evening insulin than with the overnight basal or target; that reading is the author’s and is offered as interpretation.</w:t>
+        <w:t xml:space="preserve">The application studied was TuneMyBG, version 1.0.5 (Adam Kowalczyk, Lubliniec, Poland; distributed through Google Play) [4]; the package and the four prompts were copied verbatim from it. The application’s source is not available, so its repair prompt and acceptance behaviour were established by pasting 25 real model outputs into the result screen and recording what it did. The application’s synthetic demonstration package served as a control. The study package was generated by the application from the author’s own Nightscout instance and AndroidAPS profile: 14 days of CGM data, mean glucose 121.6 mg/dl, time in range 86.0 per cent, time below 70 mg/dl (3.9 mmol/L [11]) 5.1 per cent, 275.95 units of bolus and SMB insulin in its treatment records, and no carbohydrate entries, since the author does not log meals. The profile had a single ISF of 56 mg/dl per unit, overnight targets of 90 mg/dl, a DIA of 10 hours, a maximum basal of 12 U/h and a maximum insulin on board (IOB) of 25 U. Time below 70 mg/dl peaks at 18.5 per cent in the hour after midnight and has fallen to low single figures by 04:00 with the same basal segment running, which under a 10-hour DIA is more consistent with the tail of evening insulin than with the overnight basal or target; that reading is the author’s and is offered as interpretation.</w:t>
       </w:r>
     </w:p>
     <w:p>
@@ -217,7 +217,7 @@
         <w:spacing w:line="480" w:lineRule="auto"/>
       </w:pPr>
       <w:r>
-        <w:t xml:space="preserve">The application issues a repair prompt for three conditions: decision rows missing from or absent in the inventory, a current value not copied exactly, and a primary recommendation focus outside the five allowed words. It stops without a prompt when the paste is not valid JSON or a required string field is absent. It accepts everything else, including missing sections, invalid status, confidence and priority words, and extra keys. The validator built from these observations reproduces the application’s verdict on all 25 informative test pastes (Supplementary Table S2), and it, rather than the application, judged the study’s responses. A repair prompt was sent once in the same conversation when needed, and each conversation was classified as accepted at first paste, accepted after repair, rejected with no prompt offered, or still rejected after repair; rules stated in the prompts but not enforced were recorded separately. Content analyses cover accepted conversations only, since the application holds nothing from a rejected one.</w:t>
+        <w:t xml:space="preserve">The application issues a repair prompt for three conditions: decision rows missing from or absent in the inventory, a current value not copied exactly, and a primary recommendation focus outside the five allowed words. It stops without a prompt when the paste is not valid JSON or a required string field is absent. It accepts everything else, including invalid enum words, missing sections and extra keys. The validator built from these observations reproduces the application’s verdict on all 25 informative test pastes (Supplementary Table S2), and it, rather than the application, judged the study’s responses. A repair prompt was sent once in the same conversation when needed, and each conversation was classified as accepted at first paste, accepted after repair, rejected with no prompt offered, or still rejected after repair; rules stated in the prompts but not enforced were recorded separately. Content analyses cover accepted conversations only, since the application holds nothing from a rejected one.</w:t>
       </w:r>
     </w:p>
     <w:bookmarkEnd w:id="13"/>
@@ -237,7 +237,7 @@
         <w:spacing w:line="480" w:lineRule="auto"/>
       </w:pPr>
       <w:r>
-        <w:t xml:space="preserve">Whether the models read the record was measured by checking every figure with a unit quoted in an accepted response against the numbers in the package, and by recording whether each response recognised the absence of carbohydrate data and how it scored the meal strategy step. Whether the models agreed was measured, for each of the 23 settings, by the proportion of accepted conversations proposing a change and the values proposed, and by a stability index, the mean over settings of the proportion of conversations agreeing with the modal decision. What the check made of it was measured by the acceptance classes and the proportion of accepted responses breaking an unenforced rule. Proportions carry Wilson 95 per cent intervals with the conversation as the unit. Within-model results are solid; the between-model comparison is provisional, since the models are versioned services; the reasons offered for the differences are interpretation. All analyses were specified before the runs except the carbohydrate-handling examination, the citation check, the per-decision check of whether a change’s rationale cited a figure from the record, and the reading of the overnight rationales for whether they attributed the lows to earlier insulin or to the setting itself, which were added after inspection of the outputs.</w:t>
+        <w:t xml:space="preserve">Whether the models read the record was measured by checking every figure with a unit quoted in an accepted response against the numbers in the package, and by recording whether each response recognised the absence of carbohydrate data and how it scored the meal strategy step. Whether the models agreed was measured, for each of the 23 settings, by the proportion of accepted conversations proposing a change and the values proposed, and by a stability index, the mean over settings of the proportion of conversations agreeing with the modal decision. What the check made of it was measured by the acceptance classes and the proportion of accepted responses breaking an unenforced rule. Proportions carry Wilson 95 per cent intervals with the conversation as the unit. Within-model results are solid; the between-model comparison is provisional, since the models are versioned services; the reasons offered for the differences are interpretation. All analyses were specified before the runs except the carbohydrate-handling examination, the citation check, the per-decision check of whether a change’s rationale cited a figure from the record, and the reading of the overnight rationales for whether they attributed the lows to earlier insulin or to the setting itself, and the examination of how responses read the package’s insulin total, all added after inspection of the outputs.</w:t>
       </w:r>
     </w:p>
     <w:bookmarkEnd w:id="14"/>
@@ -268,7 +268,7 @@
         <w:spacing w:line="480" w:lineRule="auto"/>
       </w:pPr>
       <w:r>
-        <w:t xml:space="preserve">On the control package all 50 Gemini 3.6 Flash conversations kept every setting unchanged, so the remainder concerns the study record. The models quoted the record accurately (post hoc analysis): of the figures with a unit in accepted responses, 96.8 per cent (Opus) to 100 per cent (GPT-5.4-mini, Llama) were present in the package, the remainder being thresholds or simple derived quantities. Where a response changed a setting, the rationale cited at least one figure from the record in 85 to 100 per cent of changes for eight models, in 69 per cent for Gemini 3.1 Pro, in neither of GPT-5.4-mini’s two changes, and in 5 per cent for Llama, whose changes carried no figure at all in 53 of 56 (Supplementary Table S3); no rationale quoted a figure that was absent from the record. Each model recognised that no carbohydrates had been logged in at least 70 per cent of its conversations (post hoc analysis). Only Llama changed a carbohydrate ratio (2 of 44 conversations); the others said the ratios could not be tested without meal data. The three models that acted on the safety limits cited the same arithmetic, a 25 U ceiling against roughly 19.7 U of insulin a day, and both branches of the fork described below cited the same figure, 18.5 per cent of readings below 70 mg/dl at 01:00.</w:t>
+        <w:t xml:space="preserve">On the control package all 50 Gemini 3.6 Flash conversations kept every setting unchanged, so the remainder concerns the study record. The models quoted the record accurately (post hoc analysis): of the figures with a unit in accepted responses, 96.8 per cent (Opus) to 100 per cent (GPT-5.4-mini, Llama) were present in the package, the remainder being thresholds or simple derived quantities. Where a response changed a setting, the rationale cited at least one figure from the record in 85 to 100 per cent of changes for eight models, in 69 per cent for Gemini 3.1 Pro and in 5 per cent for Llama (Supplementary Table S3); no rationale quoted a figure that was absent from the record. Each model recognised that no carbohydrates had been logged in at least 70 per cent of its conversations (post hoc analysis). Only Llama changed a carbohydrate ratio (2 of 44 conversations); the others said the ratios could not be tested without meal data. The three models that acted on the safety limits cited the same arithmetic, a 25 U ceiling against roughly 19.7 U of insulin a day, and both branches of the fork described below cited the same figure, 18.5 per cent of readings below 70 mg/dl at 01:00. The 19.7 U is a figure the models inherited: the package’s insulin total sums only the bolus and SMB records, carries no basal delivery, and its scheduled basal adds 16.2 U a day (post hoc analysis; Supplementary Table S4). Flash treated the bolus-only sum as the daily total in 49 of 50 conversations and lowered the limit in 48 of them; GPT-5.4-mini, Haiku and Opus noted the omission in 67 to 95 per cent of theirs, and Opus reconstructed a total near 36 U a day in all 11.</w:t>
       </w:r>
     </w:p>
     <w:bookmarkEnd w:id="16"/>
@@ -288,7 +288,7 @@
         <w:spacing w:line="480" w:lineRule="auto"/>
       </w:pPr>
       <w:r>
-        <w:t xml:space="preserve">Table 2 compares the models. Gemini 3.6 Flash, Gemini 3.1 Pro and Opus lowered the IOB limit in 98, 90 and 73 per cent of accepted conversations; GPT-5.6-sol, GPT-5.4-mini, Sonnet and Grok left it alone throughout; DeepSeek and Llama lowered it in 44 and 39 per cent. The overnight target was raised by the Gemini models in 78 to 90 per cent of conversations, by GPT-5.6-sol in 36 per cent and by Grok in 20 per cent. Four models changed nothing in most conversations: GPT-5.4-mini in 46 of 48, Sonnet in 18 of 19, Grok in 40 of 50 and Flash-Lite in 32 of 39.</w:t>
+        <w:t xml:space="preserve">Table 2 compares the models. Gemini 3.6 Flash, Gemini 3.1 Pro and Opus lowered the IOB limit in 98, 90 and 73 per cent of accepted conversations; four models left it alone throughout; DeepSeek and Llama lowered it in 44 and 39 per cent. Four models changed nothing in most conversations: GPT-5.4-mini in 46 of 48, Sonnet in 18 of 19, Grok in 40 of 50 and Flash-Lite in 32 of 39.</w:t>
       </w:r>
     </w:p>
     <w:p>
@@ -297,7 +297,7 @@
         <w:spacing w:line="480" w:lineRule="auto"/>
       </w:pPr>
       <w:r>
-        <w:t xml:space="preserve">Within a model the direction of a change was usually consistent and the number was not (Figures 2 and 3). Gemini 3.6 Flash lowered the IOB limit in 49 of 50 conversations (98 per cent, 89.5 to 99.6) and the basal limit in 48, proposing 18 distinct pairs of values: IOB from 4 to 15 U and maximum basal from 2.5 to 4 U/h. Gemini 3.1 Pro produced 17 distinct pairs and Opus, in 8 of 11 conversations (73 per cent, 43.4 to 90.3), five. Stability indices ranged from 0.915 (DeepSeek) and 0.928 (Haiku) to 0.998 (GPT-5.4-mini and Sonnet); an index of 1 would mean the same decision on all settings in all conversations; for the least stable model roughly one decision in twelve departed from the modal answer, and the highest indices belonged to the models that changed nothing.</w:t>
+        <w:t xml:space="preserve">Within a model the direction of a change was usually consistent and the number was not (Figures 2 and 3). Gemini 3.6 Flash lowered the IOB limit in 49 of 50 conversations (98 per cent, 89.5 to 99.6) and the basal limit in 48, proposing 18 distinct pairs of values. Gemini 3.1 Pro produced 17 distinct pairs and Opus, in 8 of 11 conversations (73 per cent, 43.4 to 90.3), five. Stability indices ranged from 0.915 (DeepSeek) and 0.928 (Haiku) to 0.998 (GPT-5.4-mini and Sonnet); an index of 1 would mean the same decision on all settings in all conversations; for the least stable model roughly one decision in twelve departed from the modal answer, and the highest indices belonged to the models that changed nothing.</w:t>
       </w:r>
     </w:p>
     <w:p>
@@ -413,7 +413,7 @@
         <w:spacing w:line="480" w:lineRule="auto"/>
       </w:pPr>
       <w:r>
-        <w:t xml:space="preserve">This is a different failure from the two described for models given raw five-minute data, where settings anchored on training priors and the cited readings were unreliable [9]. Here the package carried the current profile and the check enforced the copying of current values, the two safeguards that paper proposed. The misquotation did not recur, and for eight of the eleven models nearly every change was argued from a figure in the record, for Gemini 3.1 Pro two thirds were; Llama changed settings without citing one, and DeepSeek’s shortening of the 10-hour DIA to 5 to 8 hours in eight conversations has the shape of the textbook anchoring seen before. The comparison is between two studies with different records, prompts and models, so it shows that the earlier failures were largely absent here rather than that the package removed them. What the models argued from the record was not stable: with good evidence they generate several plausible conclusions and the sampling decides which is shown. A structured package appears to fix what the model reads and to leave untouched what it decides, and the product sells the decision.</w:t>
+        <w:t xml:space="preserve">This is a different failure from the two described for models given raw five-minute data, where settings anchored on training priors and the cited readings were unreliable [9]. Here the package carried the current profile and the check enforced the copying of current values, the two safeguards that paper proposed. The misquotation did not recur, and for eight of the eleven models nearly every change was argued from a figure in the record, for Gemini 3.1 Pro two thirds were; Llama changed settings without citing one, and DeepSeek’s shortening of the 10-hour DIA to 5 to 8 hours in eight conversations has the shape of the textbook anchoring seen before. The comparison is between two studies with different records, prompts and models, so it shows that the earlier failures were largely absent here rather than that the package removed them. The package also fixes what the models do not see: its insulin total omits basal delivery, and the model that cut the safety limits most often was the model that mistook the bolus-only sum for the whole. What the models argued from the record was not stable: with good evidence they generate several plausible conclusions and the sampling decides which is shown. A structured package appears to fix what the model reads and to leave untouched what it decides, and the product sells the decision.</w:t>
       </w:r>
     </w:p>
     <w:p>

</xml_diff>

<commit_message>
Trim the body back under 3,000 words after the bolus-only insulin finding
Co-Authored-By: Claude Fable 5 <noreply@anthropic.com>
Claude-Session: https://claude.ai/code/session_01RLjJb3Wq5Q2cbr99Sz9XTW
</commit_message>
<xml_diff>
--- a/paper/STREET Manuscript 1.docx
+++ b/paper/STREET Manuscript 1.docx
@@ -177,7 +177,7 @@
         <w:spacing w:line="480" w:lineRule="auto"/>
       </w:pPr>
       <w:r>
-        <w:t xml:space="preserve">One record was used by design. The question is whether the same input yields the same review, and holding the input fixed while the conversation is repeated attributes all observed variation to the model and the application rather than to differences between records. A study of whether the advice is correct would need many records and a reference standard, and is a different study. The data are the author’s own; he gave written consent to their use and publication, and no other person’s data were involved, so no institutional review board approval was sought. No change was made to any treatment.</w:t>
+        <w:t xml:space="preserve">One record was used by design. The question is whether the same input yields the same review, and holding the input fixed while the conversation is repeated attributes all observed variation to the model and the application. A study of whether the advice is correct would need many records and a reference standard, and is a different study. The data are the author’s own; he gave written consent to their use and publication, and no other person’s data were involved, so no institutional review board approval was sought. No change was made to any treatment.</w:t>
       </w:r>
     </w:p>
     <w:bookmarkEnd w:id="11"/>
@@ -268,7 +268,7 @@
         <w:spacing w:line="480" w:lineRule="auto"/>
       </w:pPr>
       <w:r>
-        <w:t xml:space="preserve">On the control package all 50 Gemini 3.6 Flash conversations kept every setting unchanged, so the remainder concerns the study record. The models quoted the record accurately (post hoc analysis): of the figures with a unit in accepted responses, 96.8 per cent (Opus) to 100 per cent (GPT-5.4-mini, Llama) were present in the package, the remainder being thresholds or simple derived quantities. Where a response changed a setting, the rationale cited at least one figure from the record in 85 to 100 per cent of changes for eight models, in 69 per cent for Gemini 3.1 Pro and in 5 per cent for Llama (Supplementary Table S3); no rationale quoted a figure that was absent from the record. Each model recognised that no carbohydrates had been logged in at least 70 per cent of its conversations (post hoc analysis). Only Llama changed a carbohydrate ratio (2 of 44 conversations); the others said the ratios could not be tested without meal data. The three models that acted on the safety limits cited the same arithmetic, a 25 U ceiling against roughly 19.7 U of insulin a day, and both branches of the fork described below cited the same figure, 18.5 per cent of readings below 70 mg/dl at 01:00. The 19.7 U is a figure the models inherited: the package’s insulin total sums only the bolus and SMB records, carries no basal delivery, and its scheduled basal adds 16.2 U a day (post hoc analysis; Supplementary Table S4). Flash treated the bolus-only sum as the daily total in 49 of 50 conversations and lowered the limit in 48 of them; GPT-5.4-mini, Haiku and Opus noted the omission in 67 to 95 per cent of theirs, and Opus reconstructed a total near 36 U a day in all 11.</w:t>
+        <w:t xml:space="preserve">On the control package all 50 Gemini 3.6 Flash conversations kept every setting unchanged, so the remainder concerns the study record. The models quoted the record accurately (post hoc analysis): of the figures with a unit in accepted responses, 96.8 per cent (Opus) to 100 per cent (GPT-5.4-mini, Llama) were present in the package. Where a response changed a setting, the rationale cited at least one figure from the record in 85 to 100 per cent of changes for eight models, in 69 per cent for Gemini 3.1 Pro and in 5 per cent for Llama (Supplementary Table S3); no rationale quoted a figure that was absent from the record. Each model recognised that no carbohydrates had been logged in at least 70 per cent of its conversations (post hoc analysis). Only Llama changed a carbohydrate ratio (2 of 44 conversations); the others said the ratios could not be tested without meal data. The three models that acted on the safety limits cited the same arithmetic, a 25 U ceiling against roughly 19.7 U of insulin a day, and both branches of the fork described below cited the same figure, 18.5 per cent of readings below 70 mg/dl at 01:00. The 19.7 U is a figure the models inherited: the package’s insulin total sums only the bolus and SMB records, carries no basal delivery, and its scheduled basal adds 16.2 U a day (post hoc analysis; Supplementary Table S4). Flash took the bolus-only sum as the daily total in 49 of 50 conversations and lowered the limit in 48; GPT-5.4-mini, Haiku and Opus noted the omission in 67 to 95 per cent of theirs, and Opus reconstructed about 36 U a day in all 11.</w:t>
       </w:r>
     </w:p>
     <w:bookmarkEnd w:id="16"/>
@@ -288,7 +288,7 @@
         <w:spacing w:line="480" w:lineRule="auto"/>
       </w:pPr>
       <w:r>
-        <w:t xml:space="preserve">Table 2 compares the models. Gemini 3.6 Flash, Gemini 3.1 Pro and Opus lowered the IOB limit in 98, 90 and 73 per cent of accepted conversations; four models left it alone throughout; DeepSeek and Llama lowered it in 44 and 39 per cent. Four models changed nothing in most conversations: GPT-5.4-mini in 46 of 48, Sonnet in 18 of 19, Grok in 40 of 50 and Flash-Lite in 32 of 39.</w:t>
+        <w:t xml:space="preserve">Gemini 3.6 Flash, Gemini 3.1 Pro and Opus lowered the IOB limit in 98, 90 and 73 per cent of accepted conversations; four models left it alone throughout; DeepSeek and Llama lowered it in 44 and 39 per cent. Four models changed nothing in most conversations, GPT-5.4-mini in 46 of 48 and Sonnet in 18 of 19 among them.</w:t>
       </w:r>
     </w:p>
     <w:p>
@@ -345,7 +345,7 @@
         <w:t xml:space="preserve"> </w:t>
       </w:r>
       <w:r>
-        <w:t xml:space="preserve">in 40 of 50 conversations and still raised the target in 45, 36 of them while naming the stacking, as a buffer against it. Llama offered no causal attribution in 18 of its 23 basal changes.</w:t>
+        <w:t xml:space="preserve">in 40 of 50 conversations and still raised the target in 45, 36 of them while naming the stacking. Llama offered no causal attribution in 18 of its 23 basal changes.</w:t>
       </w:r>
     </w:p>
     <w:p>
@@ -383,7 +383,7 @@
         <w:spacing w:line="480" w:lineRule="auto"/>
       </w:pPr>
       <w:r>
-        <w:t xml:space="preserve">Nothing in the preceding section was caught: the check accepted all 40 safety-limit pairs from the three models that lowered the limits, both branches of the Flash fork, both directions of the Llama basal change, all 14 DeepSeek sensitivity factors and each meal step marked completed on a record with no meals. Among accepted responses the proportion breaking a rule the prompts state but the check does not enforce ranged from none (GPT-5.6-sol) to 25 of 48 (GPT-5.4-mini) and 17 of 20 (Haiku), the commonest breaches being confidence words outside the allowed set, a missing issues section and extra keys, all of which reach the result screen.</w:t>
+        <w:t xml:space="preserve">Nothing in the preceding section was caught: the check accepted all 40 safety-limit pairs from the three models that lowered the limits, both branches of the Flash fork, both directions of the Llama basal change, all 14 DeepSeek sensitivity factors and each meal step marked completed on a record with no meals. Among accepted responses the proportion breaking a rule the prompts state but the check does not enforce ranged from none (GPT-5.6-sol) to 25 of 48 (GPT-5.4-mini) and 17 of 20 (Haiku), the commonest breaches being confidence words outside the allowed set, a missing issues section and extra keys, which reach the result screen.</w:t>
       </w:r>
     </w:p>
     <w:bookmarkEnd w:id="18"/>
@@ -413,7 +413,7 @@
         <w:spacing w:line="480" w:lineRule="auto"/>
       </w:pPr>
       <w:r>
-        <w:t xml:space="preserve">This is a different failure from the two described for models given raw five-minute data, where settings anchored on training priors and the cited readings were unreliable [9]. Here the package carried the current profile and the check enforced the copying of current values, the two safeguards that paper proposed. The misquotation did not recur, and for eight of the eleven models nearly every change was argued from a figure in the record, for Gemini 3.1 Pro two thirds were; Llama changed settings without citing one, and DeepSeek’s shortening of the 10-hour DIA to 5 to 8 hours in eight conversations has the shape of the textbook anchoring seen before. The comparison is between two studies with different records, prompts and models, so it shows that the earlier failures were largely absent here rather than that the package removed them. The package also fixes what the models do not see: its insulin total omits basal delivery, and the model that cut the safety limits most often was the model that mistook the bolus-only sum for the whole. What the models argued from the record was not stable: with good evidence they generate several plausible conclusions and the sampling decides which is shown. A structured package appears to fix what the model reads and to leave untouched what it decides, and the product sells the decision.</w:t>
+        <w:t xml:space="preserve">This is a different failure from the two described for models given raw five-minute data, where settings anchored on training priors and the cited readings were unreliable [9]. Here the package carried the current profile and the check enforced the copying of current values, the two safeguards that paper proposed. The misquotation did not recur, and for eight of the eleven models nearly every change was argued from a figure in the record, for Gemini 3.1 Pro two thirds were; Llama changed settings without citing one, and DeepSeek’s shortening of the 10-hour DIA to 5 to 8 hours in eight conversations has the shape of the textbook anchoring seen before. The comparison is between two studies with different records, prompts and models, so it shows that the earlier failures were largely absent here rather than that the package removed them. The package also fixes what the models do not see: its insulin total omits basal delivery, and the model that cut the safety limits most often was the one that mistook the bolus-only sum for the whole. What the models argued from the record was not stable: with good evidence they generate several plausible conclusions and the sampling decides which is shown. A structured package appears to fix what the model reads and to leave untouched what it decides, and the product sells the decision.</w:t>
       </w:r>
     </w:p>
     <w:p>

</xml_diff>

<commit_message>
Body back under 3,000 words; rebuild manuscript and preprint with the trims applied
Co-Authored-By: Claude Fable 5 <noreply@anthropic.com>
Claude-Session: https://claude.ai/code/session_01RLjJb3Wq5Q2cbr99Sz9XTW
</commit_message>
<xml_diff>
--- a/paper/STREET Manuscript 1.docx
+++ b/paper/STREET Manuscript 1.docx
@@ -197,7 +197,7 @@
         <w:spacing w:line="480" w:lineRule="auto"/>
       </w:pPr>
       <w:r>
-        <w:t xml:space="preserve">Each conversation was started afresh, with the package attached to the first prompt and the remaining prompts sent in turn. No sampling parameters were set, so each provider’s default applied. Eleven models were run on 21 and 22 August 2026: Gemini 3.6 Flash, Gemini 3.1 Pro Preview and Gemini 3.5 Flash-Lite (Google, Mountain View, California, USA); GPT-5.6-sol and GPT-5.4-mini at the medium reasoning setting (OpenAI, San Francisco, California, USA); Claude Opus 5, Claude Sonnet 5 and Claude Haiku 4.5 (Anthropic, San Francisco, California, USA); DeepSeek V4 Pro (DeepSeek, Hangzhou, China); Grok 4.6 (xAI, Palo Alto, California, USA); and Llama 4 Maverick (Meta, Menlo Park, California, USA), the last three through OpenRouter (New York, New York, USA). Fifty conversations were run per model, except Opus and Sonnet at 20 because of cost, and the served model identifier was recorded for every turn (Supplementary Table S1). Conversations ran through the providers’ programming interfaces, so the results describe the models rather than any chat product.</w:t>
+        <w:t xml:space="preserve">Each conversation was fresh, with the package attached to the first prompt and the remaining prompts sent in turn. No sampling parameters were set, so each provider’s default applied. Eleven models were run on 21 and 22 August 2026: Gemini 3.6 Flash, Gemini 3.1 Pro Preview and Gemini 3.5 Flash-Lite (Google, Mountain View, California, USA); GPT-5.6-sol and GPT-5.4-mini at the medium reasoning setting (OpenAI, San Francisco, California, USA); Claude Opus 5, Claude Sonnet 5 and Claude Haiku 4.5 (Anthropic, San Francisco, California, USA); DeepSeek V4 Pro (DeepSeek, Hangzhou, China); Grok 4.6 (xAI, Palo Alto, California, USA); and Llama 4 Maverick (Meta, Menlo Park, California, USA), the last three through OpenRouter (New York, New York, USA). Fifty conversations were run per model, except Opus and Sonnet at 20 because of cost, and the served model identifier was recorded for every turn (Supplementary Table S1). Conversations ran through the providers’ programming interfaces, so the results describe the models rather than any chat product.</w:t>
       </w:r>
     </w:p>
     <w:bookmarkEnd w:id="12"/>
@@ -268,7 +268,7 @@
         <w:spacing w:line="480" w:lineRule="auto"/>
       </w:pPr>
       <w:r>
-        <w:t xml:space="preserve">On the control package all 50 Gemini 3.6 Flash conversations kept every setting unchanged, so the remainder concerns the study record. The models quoted the record accurately (post hoc analysis): of the figures with a unit in accepted responses, 96.8 per cent (Opus) to 100 per cent (GPT-5.4-mini, Llama) were present in the package. Where a response changed a setting, the rationale cited at least one figure from the record in 85 to 100 per cent of changes for eight models, in 69 per cent for Gemini 3.1 Pro and in 5 per cent for Llama (Supplementary Table S3); no rationale quoted a figure that was absent from the record. Each model recognised that no carbohydrates had been logged in at least 70 per cent of its conversations (post hoc analysis). Only Llama changed a carbohydrate ratio (2 of 44 conversations); the others said the ratios could not be tested without meal data. The three models that acted on the safety limits cited the same arithmetic, a 25 U ceiling against roughly 19.7 U of insulin a day, and both branches of the fork described below cited the same figure, 18.5 per cent of readings below 70 mg/dl at 01:00. The 19.7 U is a figure the models inherited: the package’s insulin total sums only the bolus and SMB records, carries no basal delivery, and its scheduled basal adds 16.2 U a day (post hoc analysis; Supplementary Table S4). Flash took the bolus-only sum as the daily total in 49 of 50 conversations and lowered the limit in 48; GPT-5.4-mini, Haiku and Opus noted the omission in 67 to 95 per cent of theirs, and Opus reconstructed about 36 U a day in all 11.</w:t>
+        <w:t xml:space="preserve">On the control package all 50 Gemini 3.6 Flash conversations kept every setting unchanged; the remainder concerns the study record. The models quoted the record accurately (post hoc analysis): of the figures with a unit in accepted responses, 96.8 per cent (Opus) to 100 per cent (GPT-5.4-mini, Llama) were present in the package. Where a response changed a setting, the rationale cited at least one figure from the record in 85 to 100 per cent of changes for eight models, in 69 per cent for Gemini 3.1 Pro and in 5 per cent for Llama (Supplementary Table S3); no rationale quoted a figure that was absent from the record. Each model recognised that no carbohydrates had been logged in at least 70 per cent of its conversations (post hoc analysis). Only Llama changed a carbohydrate ratio (2 of 44 conversations); the others said the ratios could not be tested without meal data. The three models that acted on the safety limits cited the same arithmetic, a 25 U ceiling against roughly 19.7 U of insulin a day, and both branches of the fork described below cited the same figure, 18.5 per cent of readings below 70 mg/dl at 01:00. The 19.7 U is inherited: the package’s insulin total sums only the bolus and SMB records, it carries no basal delivery, and its scheduled basal adds 16.2 U a day (post hoc analysis; Supplementary Table S4). Flash took the bolus-only sum as the daily total in 49 of 50 conversations and lowered the limit in 48; GPT-5.4-mini, Haiku and Opus noted the omission in 67 to 95 per cent of theirs, and Opus reconstructed about 36 U a day in all 11.</w:t>
       </w:r>
     </w:p>
     <w:bookmarkEnd w:id="16"/>
@@ -288,7 +288,7 @@
         <w:spacing w:line="480" w:lineRule="auto"/>
       </w:pPr>
       <w:r>
-        <w:t xml:space="preserve">Gemini 3.6 Flash, Gemini 3.1 Pro and Opus lowered the IOB limit in 98, 90 and 73 per cent of accepted conversations; four models left it alone throughout; DeepSeek and Llama lowered it in 44 and 39 per cent. Four models changed nothing in most conversations, GPT-5.4-mini in 46 of 48 and Sonnet in 18 of 19 among them.</w:t>
+        <w:t xml:space="preserve">Gemini 3.6 Flash, Gemini 3.1 Pro and Opus lowered the IOB limit in 98, 90 and 73 per cent of accepted conversations; four models left it alone throughout; DeepSeek and Llama lowered it in 44 and 39 per cent. Four models changed nothing in most conversations, GPT-5.4-mini and Sonnet among them.</w:t>
       </w:r>
     </w:p>
     <w:p>
@@ -297,7 +297,7 @@
         <w:spacing w:line="480" w:lineRule="auto"/>
       </w:pPr>
       <w:r>
-        <w:t xml:space="preserve">Within a model the direction of a change was usually consistent and the number was not (Figures 2 and 3). Gemini 3.6 Flash lowered the IOB limit in 49 of 50 conversations (98 per cent, 89.5 to 99.6) and the basal limit in 48, proposing 18 distinct pairs of values. Gemini 3.1 Pro produced 17 distinct pairs and Opus, in 8 of 11 conversations (73 per cent, 43.4 to 90.3), five. Stability indices ranged from 0.915 (DeepSeek) and 0.928 (Haiku) to 0.998 (GPT-5.4-mini and Sonnet); an index of 1 would mean the same decision on all settings in all conversations; for the least stable model roughly one decision in twelve departed from the modal answer, and the highest indices belonged to the models that changed nothing.</w:t>
+        <w:t xml:space="preserve">Within a model the direction of a change was usually consistent and the number was not (Figures 2 and 3). Gemini 3.6 Flash lowered the IOB limit in 49 of 50 conversations (98 per cent, 89.5 to 99.6) and the basal limit in 48, proposing 18 distinct pairs of values. Gemini 3.1 Pro produced 17 distinct pairs and Opus, in 8 of 11 conversations (73 per cent, 43.4 to 90.3), five. Stability indices ranged from 0.915 (DeepSeek) and 0.928 (Haiku) to 0.998 (GPT-5.4-mini and Sonnet); an index of 1 would mean the same decision on all settings in all conversations; for the least stable model roughly one decision in twelve departed from the modal answer.</w:t>
       </w:r>
     </w:p>
     <w:p>
@@ -324,7 +324,7 @@
         <w:t xml:space="preserve">“basal”</w:t>
       </w:r>
       <w:r>
-        <w:t xml:space="preserve">. Llama changed the midnight basal in 23 of 44 accepted conversations, raising it to 0.65 U/h in 16 and lowering it to 0.55 U/h in the other seven. DeepSeek changed the ISF in 20 of 48 (42 per cent, 28.8 to 55.7), proposing 14 distinct values from 30 to 180 mg/dl per unit against a current 56.</w:t>
+        <w:t xml:space="preserve">. Llama changed the midnight basal in 23 of 44 accepted conversations, raising it to 0.65 U/h in 16 and lowering it to 0.55 U/h in seven. DeepSeek changed the ISF in 20 of 48 (42 per cent, 28.8 to 55.7), proposing 14 distinct values from 30 to 180 mg/dl per unit against a current 56.</w:t>
       </w:r>
     </w:p>
     <w:p>
@@ -333,7 +333,7 @@
         <w:spacing w:line="480" w:lineRule="auto"/>
       </w:pPr>
       <w:r>
-        <w:t xml:space="preserve">The overnight lows themselves were read three ways (Table 3; post hoc analysis). Opus and Sonnet traced them to earlier insulin in 11 of 11 and 18 of 19 conversations, and neither model changed the overnight target or basal in any conversation. Gemini 3.1 Pro traced the lows to</w:t>
+        <w:t xml:space="preserve">The overnight lows themselves were read three ways (Table 3; post hoc analysis). Opus and Sonnet traced them to earlier insulin in 11 of 11 and 18 of 19 conversations, and neither changed the overnight target or basal in any conversation. Gemini 3.1 Pro traced the lows to</w:t>
       </w:r>
       <w:r>
         <w:t xml:space="preserve"> </w:t>

</xml_diff>

<commit_message>
Priors as the audit instrument: Discussion extended (adherence propagates omissions, training knowledge is what questioned the data), article and commentary updated
Co-Authored-By: Claude Fable 5 <noreply@anthropic.com>
Claude-Session: https://claude.ai/code/session_01RLjJb3Wq5Q2cbr99Sz9XTW
</commit_message>
<xml_diff>
--- a/paper/STREET Manuscript 1.docx
+++ b/paper/STREET Manuscript 1.docx
@@ -237,7 +237,7 @@
         <w:spacing w:line="480" w:lineRule="auto"/>
       </w:pPr>
       <w:r>
-        <w:t xml:space="preserve">Whether the models read the record was measured by checking every figure with a unit quoted in an accepted response against the numbers in the package, and by recording whether each response recognised the absence of carbohydrate data and how it scored the meal strategy step. Whether the models agreed was measured, for each of the 23 settings, by the proportion of accepted conversations proposing a change and the values proposed, and by a stability index, the mean over settings of the proportion of conversations agreeing with the modal decision. What the check made of it was measured by the acceptance classes and the proportion of accepted responses breaking an unenforced rule. Proportions carry Wilson 95 per cent intervals with the conversation as the unit. Within-model results are solid; the between-model comparison is provisional, since the models are versioned services; the reasons offered for the differences are interpretation. All analyses were specified before the runs except the carbohydrate-handling examination, the citation check, the per-decision check of whether a change’s rationale cited a figure from the record, and the reading of the overnight rationales for whether they attributed the lows to earlier insulin or to the setting itself, and the examination of how responses read the package’s insulin total, all added after inspection of the outputs.</w:t>
+        <w:t xml:space="preserve">Whether the models read the record was measured by checking every figure with a unit quoted in an accepted response against the numbers in the package, and by recording whether each response recognised the absence of carbohydrate data and how it scored the meal strategy step. Whether the models agreed was measured, for each of the 23 settings, by the proportion of accepted conversations proposing a change and the values proposed, and by a stability index, the mean proportion of conversations agreeing with the modal decision per setting. What the check made of it was measured by the acceptance classes and the proportion of accepted responses breaking an unenforced rule. Proportions carry Wilson 95 per cent intervals with the conversation as the unit. Within-model results are solid; the between-model comparison is provisional, since the models are versioned services; the reasons offered for the differences are interpretation. All analyses were specified before the runs except the carbohydrate-handling examination, the citation check, the per-decision check of whether a change’s rationale cited a figure from the record, and the reading of the overnight rationales for whether they attributed the lows to earlier insulin or to the setting itself, and the examination of how responses read the package’s insulin total, all added after inspection of the outputs.</w:t>
       </w:r>
     </w:p>
     <w:bookmarkEnd w:id="14"/>
@@ -268,7 +268,7 @@
         <w:spacing w:line="480" w:lineRule="auto"/>
       </w:pPr>
       <w:r>
-        <w:t xml:space="preserve">On the control package all 50 Gemini 3.6 Flash conversations kept every setting unchanged; the remainder concerns the study record. The models quoted the record accurately (post hoc analysis): of the figures with a unit in accepted responses, 96.8 per cent (Opus) to 100 per cent (GPT-5.4-mini, Llama) were present in the package. Where a response changed a setting, the rationale cited at least one figure from the record in 85 to 100 per cent of changes for eight models, in 69 per cent for Gemini 3.1 Pro and in 5 per cent for Llama (Supplementary Table S3); no rationale quoted a figure that was absent from the record. Each model recognised that no carbohydrates had been logged in at least 70 per cent of its conversations (post hoc analysis). Only Llama changed a carbohydrate ratio (2 of 44 conversations); the others said the ratios could not be tested without meal data. The three models that acted on the safety limits cited the same arithmetic, a 25 U ceiling against roughly 19.7 U of insulin a day, and both branches of the fork described below cited the same figure, 18.5 per cent of readings below 70 mg/dl at 01:00. The 19.7 U is inherited: the package’s insulin total sums only the bolus and SMB records, it carries no basal delivery, and its scheduled basal adds 16.2 U a day (post hoc analysis; Supplementary Table S4). Flash took the bolus-only sum as the daily total in 49 of 50 conversations and lowered the limit in 48; GPT-5.4-mini, Haiku and Opus noted the omission in 67 to 95 per cent of theirs, and Opus reconstructed about 36 U a day in all 11.</w:t>
+        <w:t xml:space="preserve">On the control package all 50 Gemini 3.6 Flash conversations kept every setting unchanged; the remainder concerns the study record. The models quoted the record accurately (post hoc analysis): of the figures with a unit in accepted responses, 96.8 per cent (Opus) to 100 per cent (GPT-5.4-mini, Llama) were present in the package. Where a response changed a setting, the rationale cited at least one figure from the record in 85 to 100 per cent of changes for eight models, in 69 per cent for Gemini 3.1 Pro and in 5 per cent for Llama (Supplementary Table S3); no rationale quoted a figure that was absent from the record. Each model recognised that no carbohydrates had been logged in at least 70 per cent of its conversations (post hoc analysis). Only Llama changed a carbohydrate ratio (2 of 44 conversations); the others said the ratios could not be tested without meal data. The three models that acted on the safety limits cited the same arithmetic, a 25 U ceiling against 19.7 U of insulin a day, and both branches of the fork described below cited the same figure, 18.5 per cent of readings below 70 mg/dl at 01:00. The 19.7 U is inherited: the package’s insulin total sums only the bolus and SMB records, it carries no basal delivery, and its scheduled basal adds 16.2 U a day (post hoc analysis; Supplementary Table S4). Flash took the bolus-only sum as the daily total in 49 of 50 conversations and lowered the limit in 48; GPT-5.4-mini, Haiku and Opus noted the omission in 67 to 95 per cent of theirs, and Opus reconstructed about 36 U a day in all 11.</w:t>
       </w:r>
     </w:p>
     <w:bookmarkEnd w:id="16"/>
@@ -404,7 +404,7 @@
         <w:spacing w:line="480" w:lineRule="auto"/>
       </w:pPr>
       <w:r>
-        <w:t xml:space="preserve">On this record the review a user received depended more on which model they opened than on the data, and the application could not tell the difference. The models did not agree about what followed from the record: four models left the limits alone, three lowered them, one proposed sensitivity factors that ranged over a factor of six, and one raised a basal rate that another lowered. Within a single model the direction held and the number did not, so a second conversation on the same package would often have given a different pair of safety limits. The overnight lows show the difference at its clearest: the same figure led two models to leave the overnight settings alone because earlier insulin explained it, two to raise the target as a cushion against that same insulin, and one to change the basal without offering a cause, and only the first of these acts on what the record shows. Each answer was internally coherent and presented in the same form, so nothing on the screen tells the user which they have been given.</w:t>
+        <w:t xml:space="preserve">On this record the review a user received depended more on which model they opened than on the data, and the application could not tell the difference. The models did not agree about what followed from the record: four models left the limits alone, three lowered them, one proposed sensitivity factors that ranged over a factor of six, and one raised a basal rate that another lowered. Within a single model the direction held and the number did not. The overnight lows show the difference at its clearest: the same figure led two models to leave the overnight settings alone because earlier insulin explained it, two to raise the target as a cushion against it, and one to change the basal without offering a cause; only the first acts on what the record shows. Each answer was internally coherent and presented in the same form, so nothing on the screen tells the user which they have been given.</w:t>
       </w:r>
     </w:p>
     <w:p>
@@ -413,7 +413,7 @@
         <w:spacing w:line="480" w:lineRule="auto"/>
       </w:pPr>
       <w:r>
-        <w:t xml:space="preserve">This is a different failure from the two described for models given raw five-minute data, where settings anchored on training priors and the cited readings were unreliable [9]. Here the package carried the current profile and the check enforced the copying of current values, the two safeguards that paper proposed. The misquotation did not recur, and for eight of the eleven models nearly every change was argued from a figure in the record, for Gemini 3.1 Pro two thirds were; Llama changed settings without citing one, and DeepSeek’s shortening of the 10-hour DIA to 5 to 8 hours in eight conversations has the shape of the textbook anchoring seen before. The comparison is between two studies with different records, prompts and models, so it shows that the earlier failures were largely absent here rather than that the package removed them. The package also fixes what the models do not see: its insulin total omits basal delivery, and the model that cut the safety limits most often was the one that mistook the bolus-only sum for the whole. What the models argued from the record was not stable: with good evidence they generate several plausible conclusions and the sampling decides which is shown. A structured package appears to fix what the model reads and to leave untouched what it decides, and the product sells the decision.</w:t>
+        <w:t xml:space="preserve">This is a different failure from the two described for models given raw five-minute data, where settings anchored on training priors and the cited readings were unreliable [9]. Here the package carried the current profile and the check enforced the copying of current values, the two safeguards that paper proposed. The misquotation did not recur, and for eight of the eleven models nearly every change was argued from a figure in the record, for Gemini 3.1 Pro two thirds were; Llama changed settings without citing one, and DeepSeek’s shortening of the DIA has the shape of the textbook anchoring seen before. The comparison is between two studies with different records, prompts and models, so it shows the earlier failures largely absent here, not that the package removed them. The package also fixes what the models do not see: its insulin total omits basal delivery, and the model that cut the safety limits most often was the one that mistook the bolus-only sum for the whole. The models that read the total correctly did so from their training, since knowing that an AID system delivers basal insulin is not in the package; the priors the earlier study treated as anchoring are also a model’s means of questioning the data, and whether a conversation applies them is itself sampled. What the models argued from the record was not stable: with good evidence they generate several plausible conclusions and the sampling decides which is shown. A structured package appears to fix what the model reads and to leave untouched what it decides, and the product sells the decision.</w:t>
       </w:r>
     </w:p>
     <w:p>

</xml_diff>

<commit_message>
Complete the priors-as-audit update: article and commentary edits applied, manuscript at 2,997 words, all outputs rebuilt
Co-Authored-By: Claude Fable 5 <noreply@anthropic.com>
Claude-Session: https://claude.ai/code/session_01RLjJb3Wq5Q2cbr99Sz9XTW
</commit_message>
<xml_diff>
--- a/paper/STREET Manuscript 1.docx
+++ b/paper/STREET Manuscript 1.docx
@@ -168,7 +168,7 @@
         <w:spacing w:line="480" w:lineRule="auto"/>
       </w:pPr>
       <w:r>
-        <w:t xml:space="preserve">The application studied was TuneMyBG, version 1.0.5 (Adam Kowalczyk, Lubliniec, Poland; distributed through Google Play) [4]; the package and the four prompts were copied verbatim from it. The application’s source is not available, so its repair prompt and acceptance behaviour were established by pasting 25 real model outputs into the result screen and recording what it did. The application’s synthetic demonstration package served as a control. The study package was generated by the application from the author’s own Nightscout instance and AndroidAPS profile: 14 days of CGM data, mean glucose 121.6 mg/dl, time in range 86.0 per cent, time below 70 mg/dl (3.9 mmol/L [11]) 5.1 per cent, 275.95 units of bolus and SMB insulin in its treatment records, and no carbohydrate entries, since the author does not log meals. The profile had a single ISF of 56 mg/dl per unit, overnight targets of 90 mg/dl, a DIA of 10 hours, a maximum basal of 12 U/h and a maximum insulin on board (IOB) of 25 U. Time below 70 mg/dl peaks at 18.5 per cent in the hour after midnight and has fallen to low single figures by 04:00 with the same basal segment running, which under a 10-hour DIA is more consistent with the tail of evening insulin than with the overnight basal or target; that reading is the author’s and is offered as interpretation.</w:t>
+        <w:t xml:space="preserve">The application studied was TuneMyBG, version 1.0.5 (Adam Kowalczyk, Lubliniec, Poland; distributed through Google Play) [4]; the package and the four prompts were copied verbatim from it. The application’s source is not available, so its repair prompt and acceptance behaviour were established by pasting 25 real model outputs into the result screen and recording what it did. The application’s synthetic demonstration package served as a control. The study package was generated by the application from the author’s own Nightscout instance and AndroidAPS profile: 14 days of CGM data, mean glucose 121.6 mg/dl, time in range 86.0 per cent, time below 70 mg/dl (3.9 mmol/L [11]) 5.1 per cent, 275.95 units of bolus and SMB insulin in its treatment records, and no carbohydrate entries, since the author does not log meals. The profile had a single ISF of 56 mg/dl per unit, overnight targets of 90 mg/dl, a DIA of 10 hours, a maximum basal of 12 U/h and a maximum insulin on board (IOB) of 25 U. Time below 70 mg/dl peaks at 18.5 per cent after midnight and has fallen to low single figures by 04:00 with the same basal segment running, which under a 10-hour DIA is more consistent with the tail of evening insulin than with the overnight basal or target; that reading is the author’s and is offered as interpretation.</w:t>
       </w:r>
     </w:p>
     <w:p>
@@ -268,7 +268,7 @@
         <w:spacing w:line="480" w:lineRule="auto"/>
       </w:pPr>
       <w:r>
-        <w:t xml:space="preserve">On the control package all 50 Gemini 3.6 Flash conversations kept every setting unchanged; the remainder concerns the study record. The models quoted the record accurately (post hoc analysis): of the figures with a unit in accepted responses, 96.8 per cent (Opus) to 100 per cent (GPT-5.4-mini, Llama) were present in the package. Where a response changed a setting, the rationale cited at least one figure from the record in 85 to 100 per cent of changes for eight models, in 69 per cent for Gemini 3.1 Pro and in 5 per cent for Llama (Supplementary Table S3); no rationale quoted a figure that was absent from the record. Each model recognised that no carbohydrates had been logged in at least 70 per cent of its conversations (post hoc analysis). Only Llama changed a carbohydrate ratio (2 of 44 conversations); the others said the ratios could not be tested without meal data. The three models that acted on the safety limits cited the same arithmetic, a 25 U ceiling against 19.7 U of insulin a day, and both branches of the fork described below cited the same figure, 18.5 per cent of readings below 70 mg/dl at 01:00. The 19.7 U is inherited: the package’s insulin total sums only the bolus and SMB records, it carries no basal delivery, and its scheduled basal adds 16.2 U a day (post hoc analysis; Supplementary Table S4). Flash took the bolus-only sum as the daily total in 49 of 50 conversations and lowered the limit in 48; GPT-5.4-mini, Haiku and Opus noted the omission in 67 to 95 per cent of theirs, and Opus reconstructed about 36 U a day in all 11.</w:t>
+        <w:t xml:space="preserve">On the control package all 50 Gemini 3.6 Flash conversations kept every setting unchanged; the remainder concerns the study record. The models quoted the record accurately (post hoc analysis): of the figures with a unit in accepted responses, 96.8 per cent (Opus) to 100 per cent (GPT-5.4-mini, Llama) were present in the package. Where a response changed a setting, the rationale cited at least one figure from the record in 85 to 100 per cent of changes for eight models, in 69 per cent for Gemini 3.1 Pro and in 5 per cent for Llama (Supplementary Table S3); no rationale quoted a figure that was absent from the record. Each model recognised that no carbohydrates had been logged in at least 70 per cent of its conversations (post hoc analysis). Only Llama changed a carbohydrate ratio (2 of 44 conversations); the others said the ratios could not be tested without meal data. The three models that acted on the safety limits cited the same arithmetic, a 25 U ceiling against 19.7 U of insulin a day, and both branches of the fork below cited the same figure, 18.5 per cent of readings below 70 mg/dl at 01:00. The 19.7 U is inherited: the package’s insulin total sums only the bolus and SMB records, it carries no basal delivery, and its scheduled basal adds 16.2 U a day (post hoc analysis; Supplementary Table S4). Flash took the bolus-only sum as the daily total in 49 of 50 conversations and lowered the limit in 48; GPT-5.4-mini, Haiku and Opus noted the omission in 67 to 95 per cent of theirs; Opus reconstructed about 36 U a day in all 11.</w:t>
       </w:r>
     </w:p>
     <w:bookmarkEnd w:id="16"/>
@@ -413,7 +413,7 @@
         <w:spacing w:line="480" w:lineRule="auto"/>
       </w:pPr>
       <w:r>
-        <w:t xml:space="preserve">This is a different failure from the two described for models given raw five-minute data, where settings anchored on training priors and the cited readings were unreliable [9]. Here the package carried the current profile and the check enforced the copying of current values, the two safeguards that paper proposed. The misquotation did not recur, and for eight of the eleven models nearly every change was argued from a figure in the record, for Gemini 3.1 Pro two thirds were; Llama changed settings without citing one, and DeepSeek’s shortening of the DIA has the shape of the textbook anchoring seen before. The comparison is between two studies with different records, prompts and models, so it shows the earlier failures largely absent here, not that the package removed them. The package also fixes what the models do not see: its insulin total omits basal delivery, and the model that cut the safety limits most often was the one that mistook the bolus-only sum for the whole. The models that read the total correctly did so from their training, since knowing that an AID system delivers basal insulin is not in the package; the priors the earlier study treated as anchoring are also a model’s means of questioning the data, and whether a conversation applies them is itself sampled. What the models argued from the record was not stable: with good evidence they generate several plausible conclusions and the sampling decides which is shown. A structured package appears to fix what the model reads and to leave untouched what it decides, and the product sells the decision.</w:t>
+        <w:t xml:space="preserve">This is a different failure from the two described for models given raw five-minute data, where settings anchored on training priors and the cited readings were unreliable [9]. Here the package carried the current profile and the check enforced the copying of current values, the two safeguards that paper proposed. The misquotation did not recur, and for eight of the eleven models nearly every change was argued from a figure in the record, for Gemini 3.1 Pro two thirds were; Llama changed settings without citing one, and DeepSeek’s shortening of the DIA has the shape of the textbook anchoring seen before. The comparison is between two studies with different records, prompts and models, so it shows the earlier failures largely absent here, not that the package removed them. The package also fixes what the models do not see: its insulin total omits basal delivery, and the model that cut the safety limits most often was the one that mistook the bolus-only sum for the whole. The models that read the total correctly did so from training, since knowing that an AID system delivers basal insulin is not in the package; the priors the earlier study treated as anchoring are also a model’s means of questioning the data, and whether a draw applies them is itself sampled. What the models argued from the record was not stable: with good evidence they generate several plausible conclusions and the sampling decides which is shown. A structured package appears to fix what the model reads and to leave untouched what it decides, and the product sells the decision.</w:t>
       </w:r>
     </w:p>
     <w:p>
@@ -440,7 +440,7 @@
         <w:spacing w:line="480" w:lineRule="auto"/>
       </w:pPr>
       <w:r>
-        <w:t xml:space="preserve">The record came from one adult, so a profile with different problems might be treated differently. The validator reproduces the application’s behaviour on 25 informative tests but could differ on cases not tested. The study measured consistency, not correctness: there is no reference answer for these settings and no counterfactual glucose trajectory for any proposed change, so what is reported is what the models produced, not what would have happened had a user acted on it. The safety concern is therefore epistemic rather than a claim that any particular answer was mistaken.</w:t>
+        <w:t xml:space="preserve">A profile with different problems might be treated differently. The validator reproduces the application’s behaviour on 25 informative tests but could differ on cases not tested. The study measured consistency, not correctness: there is no reference answer for these settings and no counterfactual glucose trajectory for any proposed change, so what is reported is what the models produced, not what would have happened had a user acted on it. The safety concern is therefore epistemic rather than a claim that any particular answer was mistaken.</w:t>
       </w:r>
     </w:p>
     <w:bookmarkEnd w:id="20"/>

</xml_diff>

<commit_message>
Table S5 (timezone, diluted insulin, mmol splits), DeepSeek ISF range read as anchoring on the package's dynamic sensitivity values, Discussion and article updated
Co-Authored-By: Claude Fable 5 <noreply@anthropic.com>
Claude-Session: https://claude.ai/code/session_01RLjJb3Wq5Q2cbr99Sz9XTW
</commit_message>
<xml_diff>
--- a/paper/STREET Manuscript 1.docx
+++ b/paper/STREET Manuscript 1.docx
@@ -120,7 +120,7 @@
         <w:spacing w:line="480" w:lineRule="auto"/>
       </w:pPr>
       <w:r>
-        <w:t xml:space="preserve">A person who runs an open-source automated insulin delivery (AID) system such as AndroidAPS sets their own basal rates, carbohydrate ratios, insulin sensitivity factors (ISF), duration of insulin action (DIA) and glucose targets, and the limits that bound what the algorithm may deliver [1]. Reviewing those settings against a fortnight of glucose data is skilled work, and some users now ask general-purpose large language models (LLMs) to do it between clinic appointments [2, 3]. By August 2026 an Android application had made the practice a product [4]. It builds a JavaScript Object Notation (JSON) package from the user’s Nightscout instance and AndroidAPS profile, with a decision inventory of 23 settings, and supplies four prompts. The user opens a new conversation in whichever LLM they prefer, attaches the package with the first prompt, sends the other three in turn and pastes the final JSON response back into the application. The application checks it, returns the user to the conversation with a repair prompt if it fails, and otherwise renders a primary profile recommendation, a decision for every setting, a meal strategy and a list of recommendations; a subscription costs £4.49 a month, and no model is recommended.</w:t>
+        <w:t xml:space="preserve">A person who runs an open-source automated insulin delivery (AID) system such as AndroidAPS sets their own basal rates, carbohydrate ratios, insulin sensitivity factors (ISF), duration of insulin action (DIA) and glucose targets, and the limits that bound what the algorithm may deliver [1]. Reviewing those settings against a fortnight of glucose data is skilled work, and some users now ask general-purpose large language models (LLMs) to do it between clinic appointments [2, 3]. By August 2026 an Android application had made the practice a product [4]. It builds a JavaScript Object Notation (JSON) package from the user’s Nightscout instance and AndroidAPS profile, with a decision inventory of 23 settings, and supplies four prompts. The user opens a new conversation in whichever LLM they prefer, attaches the package with the first prompt, sends the rest in turn and pastes the final JSON response back into the application. The application checks it, returns the user to the conversation with a repair prompt if it fails, and otherwise renders a primary profile recommendation, a decision for every setting, a meal strategy and a list of recommendations; a subscription costs £4.49 a month, and no model is recommended.</w:t>
       </w:r>
     </w:p>
     <w:p>
@@ -129,7 +129,7 @@
         <w:spacing w:line="480" w:lineRule="auto"/>
       </w:pPr>
       <w:r>
-        <w:t xml:space="preserve">The product rests on the promise that a model given a well-structured record will derive a review from it, and on the assumption that checking the review’s form is enough to stand behind its content. General-purpose models answer diabetes questions fluently and sometimes wrongly [5], and their carbohydrate estimates from photographs vary from query to query [6, 7, 8]. Asked to propose pump settings from a week of raw continuous glucose monitoring (CGM) and pump data, five models anchored on textbook values unless told the user’s current settings, and 30 to 70 per cent of the glucose readings they cited were not in the data; the authors concluded that a deployment would need two safeguards, the user’s settings as context and programmatic checking of what the model cites [9]. The Diabetes Technology Network UK has advised that any suggested change to a pump setting must be checked for plausibility before it is acted on [10]. The application supplies the first safeguard, since the package carries the current profile, and its check is a form of the second; what happens to the review once both are in place has not been measured.</w:t>
+        <w:t xml:space="preserve">The product rests on the promise that a model given a well-structured record will derive a review from it, and on the assumption that checking the review’s form is enough to stand behind its content. General-purpose models answer diabetes questions fluently and sometimes wrongly [5], and their photograph-based carbohydrate estimates vary from query to query [6, 7, 8]. Asked to propose pump settings from a week of raw continuous glucose monitoring (CGM) and pump data, five models anchored on textbook values unless told the user’s current settings, and 30 to 70 per cent of the glucose readings they cited were not in the data; the authors concluded that a deployment would need two safeguards, the user’s settings as context and programmatic checking of what the model cites [9]. The Diabetes Technology Network UK has advised that any suggested change to a pump setting must be checked for plausibility before it is acted on [10]. The application supplies the first safeguard, since the package carries the current profile, and its check is a form of the second; what happens to the review once both are in place has not been measured.</w:t>
       </w:r>
     </w:p>
     <w:p>
@@ -168,7 +168,7 @@
         <w:spacing w:line="480" w:lineRule="auto"/>
       </w:pPr>
       <w:r>
-        <w:t xml:space="preserve">The application studied was TuneMyBG, version 1.0.5 (Adam Kowalczyk, Lubliniec, Poland; distributed through Google Play) [4]; the package and the four prompts were copied verbatim from it. The application’s source is not available, so its repair prompt and acceptance behaviour were established by pasting 25 real model outputs into the result screen and recording what it did. The application’s synthetic demonstration package served as a control. The study package was generated by the application from the author’s own Nightscout instance and AndroidAPS profile: 14 days of CGM data, mean glucose 121.6 mg/dl, time in range 86.0 per cent, time below 70 mg/dl (3.9 mmol/L [11]) 5.1 per cent, 275.95 units of bolus and SMB insulin in its treatment records, and no carbohydrate entries, since the author does not log meals. The profile had a single ISF of 56 mg/dl per unit, overnight targets of 90 mg/dl, a DIA of 10 hours, a maximum basal of 12 U/h and a maximum insulin on board (IOB) of 25 U. Time below 70 mg/dl peaks at 18.5 per cent after midnight and has fallen to low single figures by 04:00 with the same basal segment running, which under a 10-hour DIA is more consistent with the tail of evening insulin than with the overnight basal or target; that reading is the author’s and is offered as interpretation.</w:t>
+        <w:t xml:space="preserve">The application studied was TuneMyBG, version 1.0.5 (Adam Kowalczyk, Lubliniec, Poland; distributed through Google Play) [4]; the package and the four prompts were copied verbatim from it. The application’s source is not available, so its repair prompt and acceptance behaviour were established by pasting 25 real model outputs into the result screen. The application’s synthetic demonstration package served as a control. The study package came from the author’s own Nightscout instance and AndroidAPS profile: 14 days of CGM data, mean glucose 121.6 mg/dl, time in range 86.0 per cent, time below 70 mg/dl (3.9 mmol/L [11]) 5.1 per cent, 275.95 units of bolus and SMB insulin in its treatment records, and no carbohydrate entries, since the author does not log meals. The profile had a single ISF of 56 mg/dl per unit, overnight targets of 90 mg/dl, a DIA of 10 hours, a maximum basal of 12 U/h and a maximum insulin on board (IOB) of 25 U. Time below 70 mg/dl peaks at 18.5 per cent at 01:00 local time and has fallen to low single figures by 04:00 with the same basal segment running, which under a 10-hour DIA is more consistent with the tail of evening insulin than with the overnight basal or target; the reading is the author’s interpretation.</w:t>
       </w:r>
     </w:p>
     <w:p>
@@ -177,7 +177,7 @@
         <w:spacing w:line="480" w:lineRule="auto"/>
       </w:pPr>
       <w:r>
-        <w:t xml:space="preserve">One record was used by design. The question is whether the same input yields the same review, and holding the input fixed while the conversation is repeated attributes all observed variation to the model and the application. A study of whether the advice is correct would need many records and a reference standard, and is a different study. The data are the author’s own; he gave written consent to their use and publication, and no other person’s data were involved, so no institutional review board approval was sought. No change was made to any treatment.</w:t>
+        <w:t xml:space="preserve">One record was used by design. The question is whether the same input yields the same review, and holding the input fixed while the conversation is repeated attributes all observed variation to the model and the application. A study of whether the advice is correct would need many records and a reference standard, and is a different study. The data are the author’s own, published with his written consent; no other person’s data were involved and no institutional review board approval was sought. No change was made to any treatment.</w:t>
       </w:r>
     </w:p>
     <w:bookmarkEnd w:id="11"/>
@@ -197,7 +197,7 @@
         <w:spacing w:line="480" w:lineRule="auto"/>
       </w:pPr>
       <w:r>
-        <w:t xml:space="preserve">Each conversation was fresh, with the package attached to the first prompt and the remaining prompts sent in turn. No sampling parameters were set, so each provider’s default applied. Eleven models were run on 21 and 22 August 2026: Gemini 3.6 Flash, Gemini 3.1 Pro Preview and Gemini 3.5 Flash-Lite (Google, Mountain View, California, USA); GPT-5.6-sol and GPT-5.4-mini at the medium reasoning setting (OpenAI, San Francisco, California, USA); Claude Opus 5, Claude Sonnet 5 and Claude Haiku 4.5 (Anthropic, San Francisco, California, USA); DeepSeek V4 Pro (DeepSeek, Hangzhou, China); Grok 4.6 (xAI, Palo Alto, California, USA); and Llama 4 Maverick (Meta, Menlo Park, California, USA), the last three through OpenRouter (New York, New York, USA). Fifty conversations were run per model, except Opus and Sonnet at 20 because of cost, and the served model identifier was recorded for every turn (Supplementary Table S1). Conversations ran through the providers’ programming interfaces, so the results describe the models rather than any chat product.</w:t>
+        <w:t xml:space="preserve">Each conversation was fresh, with the package attached to the first prompt and the remaining prompts sent in turn. No sampling parameters were set, so each provider’s default applied. Eleven models were run on 21 and 22 August 2026: Gemini 3.6 Flash, Gemini 3.1 Pro Preview and Gemini 3.5 Flash-Lite (Google, Mountain View, California, USA); GPT-5.6-sol and GPT-5.4-mini at the medium reasoning setting (OpenAI, San Francisco, California, USA); Claude Opus 5, Claude Sonnet 5 and Claude Haiku 4.5 (Anthropic, San Francisco, California, USA); DeepSeek V4 Pro (DeepSeek, Hangzhou, China); Grok 4.6 (xAI, Palo Alto, California, USA); and Llama 4 Maverick (Meta, Menlo Park, California, USA), the last three through OpenRouter (New York, New York, USA). Fifty conversations ran per model, 20 for Opus and Sonnet because of cost, and the served model identifier was recorded for every turn (Supplementary Table S1). Conversations ran through the providers’ programming interfaces, so the results describe the models rather than any chat product.</w:t>
       </w:r>
     </w:p>
     <w:bookmarkEnd w:id="12"/>
@@ -237,7 +237,7 @@
         <w:spacing w:line="480" w:lineRule="auto"/>
       </w:pPr>
       <w:r>
-        <w:t xml:space="preserve">Whether the models read the record was measured by checking every figure with a unit quoted in an accepted response against the numbers in the package, and by recording whether each response recognised the absence of carbohydrate data and how it scored the meal strategy step. Whether the models agreed was measured, for each of the 23 settings, by the proportion of accepted conversations proposing a change and the values proposed, and by a stability index, the mean proportion of conversations agreeing with the modal decision per setting. What the check made of it was measured by the acceptance classes and the proportion of accepted responses breaking an unenforced rule. Proportions carry Wilson 95 per cent intervals with the conversation as the unit. Within-model results are solid; the between-model comparison is provisional, since the models are versioned services; the reasons offered for the differences are interpretation. All analyses were specified before the runs except the carbohydrate-handling examination, the citation check, the per-decision check of whether a change’s rationale cited a figure from the record, and the reading of the overnight rationales for whether they attributed the lows to earlier insulin or to the setting itself, and the examination of how responses read the package’s insulin total, all added after inspection of the outputs.</w:t>
+        <w:t xml:space="preserve">Whether the models read the record was measured by checking every figure with a unit quoted in an accepted response against the numbers in the package, and by recording whether each response recognised the absence of carbohydrate data and how it scored the meal strategy step. Whether the models agreed was measured, for each of the 23 settings, by the proportion of accepted conversations proposing a change and the values proposed, and by a stability index, the mean proportion of conversations agreeing with the modal decision per setting. What the check made of it was measured by the acceptance classes and the proportion of accepted responses breaking an unenforced rule. Proportions carry Wilson 95 per cent intervals with the conversation as the unit. Within-model results are solid; the between-model comparison is provisional, since the models are versioned services; the reasons offered for the differences are interpretation. All analyses were specified before the runs except the carbohydrate-handling examination, the citation and per-decision citation checks, the reading of the overnight rationales, and the examination of how responses read the package’s insulin total and other partial fields, all added after inspection of the outputs.</w:t>
       </w:r>
     </w:p>
     <w:bookmarkEnd w:id="14"/>
@@ -268,7 +268,7 @@
         <w:spacing w:line="480" w:lineRule="auto"/>
       </w:pPr>
       <w:r>
-        <w:t xml:space="preserve">On the control package all 50 Gemini 3.6 Flash conversations kept every setting unchanged; the remainder concerns the study record. The models quoted the record accurately (post hoc analysis): of the figures with a unit in accepted responses, 96.8 per cent (Opus) to 100 per cent (GPT-5.4-mini, Llama) were present in the package. Where a response changed a setting, the rationale cited at least one figure from the record in 85 to 100 per cent of changes for eight models, in 69 per cent for Gemini 3.1 Pro and in 5 per cent for Llama (Supplementary Table S3); no rationale quoted a figure that was absent from the record. Each model recognised that no carbohydrates had been logged in at least 70 per cent of its conversations (post hoc analysis). Only Llama changed a carbohydrate ratio (2 of 44 conversations); the others said the ratios could not be tested without meal data. The three models that acted on the safety limits cited the same arithmetic, a 25 U ceiling against 19.7 U of insulin a day, and both branches of the fork below cited the same figure, 18.5 per cent of readings below 70 mg/dl at 01:00. The 19.7 U is inherited: the package’s insulin total sums only the bolus and SMB records, it carries no basal delivery, and its scheduled basal adds 16.2 U a day (post hoc analysis; Supplementary Table S4). Flash took the bolus-only sum as the daily total in 49 of 50 conversations and lowered the limit in 48; GPT-5.4-mini, Haiku and Opus noted the omission in 67 to 95 per cent of theirs; Opus reconstructed about 36 U a day in all 11.</w:t>
+        <w:t xml:space="preserve">All 50 control-package conversations kept every setting unchanged; the remainder concerns the study record. The models quoted the record accurately (post hoc analysis): of the figures with a unit in accepted responses, 96.8 per cent (Opus) to 100 per cent (GPT-5.4-mini, Llama) were present in the package. Where a response changed a setting, the rationale cited at least one figure from the record in 85 to 100 per cent of changes for eight models, in 69 per cent for Gemini 3.1 Pro and in 5 per cent for Llama (Supplementary Table S3); no rationale quoted a figure that was absent from the record. Each model recognised that no carbohydrates had been logged in at least 70 per cent of its conversations (post hoc analysis). Only Llama changed a carbohydrate ratio; the others said the ratios could not be tested without meal data. The three models that acted on the safety limits cited the same arithmetic, a 25 U ceiling against 19.7 U of insulin a day, and both branches of the fork below cited the same figure, 18.5 per cent of readings below 70 mg/dl at 01:00. The 19.7 U is inherited: the package’s insulin total sums only the bolus and SMB records, it carries no basal delivery, and its scheduled basal adds 16.2 U a day (post hoc analysis; Supplementary Table S4). Flash took the bolus-only sum as the daily total in 49 of 50 conversations and lowered the limit in 48; GPT-5.4-mini, Haiku and Opus noted the omission in most of theirs; Opus reconstructed about 36 U a day in all 11.</w:t>
       </w:r>
     </w:p>
     <w:bookmarkEnd w:id="16"/>
@@ -324,7 +324,7 @@
         <w:t xml:space="preserve">“basal”</w:t>
       </w:r>
       <w:r>
-        <w:t xml:space="preserve">. Llama changed the midnight basal in 23 of 44 accepted conversations, raising it to 0.65 U/h in 16 and lowering it to 0.55 U/h in seven. DeepSeek changed the ISF in 20 of 48 (42 per cent, 28.8 to 55.7), proposing 14 distinct values from 30 to 180 mg/dl per unit against a current 56.</w:t>
+        <w:t xml:space="preserve">. Llama changed the midnight basal in 23 of 44 accepted conversations, raising it to 0.65 U/h in 16 and lowering it to 0.55 U/h in seven. DeepSeek changed the ISF in 20 of 48 (42 per cent, 28.8 to 55.7), proposing 14 distinct values from 30 to 180 mg/dl per unit against a current 56, a range that tracks the package’s own dynamic sensitivity values, 37.9 to 124, and reads as anchoring on them rather than invention (interpretation).</w:t>
       </w:r>
     </w:p>
     <w:p>
@@ -333,7 +333,7 @@
         <w:spacing w:line="480" w:lineRule="auto"/>
       </w:pPr>
       <w:r>
-        <w:t xml:space="preserve">The overnight lows themselves were read three ways (Table 3; post hoc analysis). Opus and Sonnet traced them to earlier insulin in 11 of 11 and 18 of 19 conversations, and neither changed the overnight target or basal in any conversation. Gemini 3.1 Pro traced the lows to</w:t>
+        <w:t xml:space="preserve">The overnight lows themselves were read three ways (Table 3; post hoc analysis). Opus and Sonnet traced them to earlier insulin in 11 of 11 and 18 of 19 conversations, and neither changed the overnight target or basal. Gemini 3.1 Pro traced the lows to</w:t>
       </w:r>
       <w:r>
         <w:t xml:space="preserve"> </w:t>
@@ -374,7 +374,7 @@
         <w:spacing w:line="480" w:lineRule="auto"/>
       </w:pPr>
       <w:r>
-        <w:t xml:space="preserve">Table 1 gives the acceptance classes with intervals. Opus produced output that was not valid JSON in nine of 20 conversations (45 per cent, 25.8 to 65.8), and Flash-Lite in 10 of 50 (20 per cent, 11.2 to 33.0); the application offers no way forward from that state. Llama recovered through the repair prompt in 25 of 50 conversations, whereas Haiku was still rejected after the repair prompt in 27 of 50 (54 per cent, 40.4 to 67.0).</w:t>
+        <w:t xml:space="preserve">Table 1 gives the acceptance classes with intervals. Opus produced invalid JSON in nine of 20 conversations (45 per cent, 25.8 to 65.8) and Flash-Lite in 10 of 50 (20 per cent, 11.2 to 33.0); the application offers no way forward from that state. Llama recovered through the repair prompt in 25 of 50 conversations, whereas Haiku was still rejected after it in 27 of 50 (54 per cent, 40.4 to 67.0).</w:t>
       </w:r>
     </w:p>
     <w:p>
@@ -404,7 +404,7 @@
         <w:spacing w:line="480" w:lineRule="auto"/>
       </w:pPr>
       <w:r>
-        <w:t xml:space="preserve">On this record the review a user received depended more on which model they opened than on the data, and the application could not tell the difference. The models did not agree about what followed from the record: four models left the limits alone, three lowered them, one proposed sensitivity factors that ranged over a factor of six, and one raised a basal rate that another lowered. Within a single model the direction held and the number did not. The overnight lows show the difference at its clearest: the same figure led two models to leave the overnight settings alone because earlier insulin explained it, two to raise the target as a cushion against it, and one to change the basal without offering a cause; only the first acts on what the record shows. Each answer was internally coherent and presented in the same form, so nothing on the screen tells the user which they have been given.</w:t>
+        <w:t xml:space="preserve">On this record the review a user received depended more on which model they opened than on the data, and the application could not tell the difference. The models did not agree about what followed from the record: four models left the limits alone, three lowered them, one proposed sensitivity factors ranging over a factor of six, and one raised a basal rate that another lowered. Within a single model the direction held and the number did not. The overnight lows show the difference at its clearest: the same figure led two models to leave the overnight settings alone because earlier insulin explained it, two to raise the target as a cushion against it, and one to change the basal without offering a cause; only the first acts on what the record shows. Each answer was internally coherent and presented in the same form, so nothing on the screen tells the user which they have been given.</w:t>
       </w:r>
     </w:p>
     <w:p>
@@ -413,7 +413,7 @@
         <w:spacing w:line="480" w:lineRule="auto"/>
       </w:pPr>
       <w:r>
-        <w:t xml:space="preserve">This is a different failure from the two described for models given raw five-minute data, where settings anchored on training priors and the cited readings were unreliable [9]. Here the package carried the current profile and the check enforced the copying of current values, the two safeguards that paper proposed. The misquotation did not recur, and for eight of the eleven models nearly every change was argued from a figure in the record, for Gemini 3.1 Pro two thirds were; Llama changed settings without citing one, and DeepSeek’s shortening of the DIA has the shape of the textbook anchoring seen before. The comparison is between two studies with different records, prompts and models, so it shows the earlier failures largely absent here, not that the package removed them. The package also fixes what the models do not see: its insulin total omits basal delivery, and the model that cut the safety limits most often was the one that mistook the bolus-only sum for the whole. The models that read the total correctly did so from training, since knowing that an AID system delivers basal insulin is not in the package; the priors the earlier study treated as anchoring are also a model’s means of questioning the data, and whether a draw applies them is itself sampled. What the models argued from the record was not stable: with good evidence they generate several plausible conclusions and the sampling decides which is shown. A structured package appears to fix what the model reads and to leave untouched what it decides, and the product sells the decision.</w:t>
+        <w:t xml:space="preserve">This is a different failure from the two seen with raw five-minute data, where settings anchored on training priors and cited readings were unreliable [9]. The package here carried the current profile and the check enforced the copying of current values, the two safeguards that paper proposed. The misquotation did not recur, and for eight of the eleven models nearly every change was argued from a figure in the record, for Gemini 3.1 Pro two thirds were; Llama changed settings without citing one, and DeepSeek’s shortening of the DIA has the shape of the textbook anchoring seen before. The comparison is between two studies with different records, prompts and models, so it shows the earlier failures largely absent here, not that the package removed them. The package also fixes what the models do not see: its insulin total omits basal delivery, and the model that cut the safety limits most often was the one that mistook the bolus-only sum for the whole. The models that read the total correctly did so from training, since knowing that an AID system delivers basal insulin is not in the package; the priors the earlier study treated as anchoring are also a model’s means of questioning the data, and whether a draw applies them is itself sampled. Two smaller splits have the same shape: the hourly glucose is keyed in both UTC and local time, and 30 conversations placed the low band at the wrong clock hour; the diluted insulin is disclosed only in a profile name string, which 90 conversations noticed (Supplementary Table S5). What the models argued from the record was not stable: with good evidence they generate several plausible conclusions and the sampling decides which is shown. A structured package appears to fix what the model reads and to leave untouched what it decides, and the product sells the decision.</w:t>
       </w:r>
     </w:p>
     <w:p>
@@ -431,7 +431,7 @@
         <w:spacing w:line="480" w:lineRule="auto"/>
       </w:pPr>
       <w:r>
-        <w:t xml:space="preserve">None of this can be cured by a temperature setting, since the chat interfaces expose none and provider-side non-determinism persists at temperature zero [12]. A design that took the variation seriously would run the analysis several times and show the spread, and would validate and pin one model rather than accept any. The advice that every suggested change be checked for plausibility before it is acted on [10] assumes a user who can recognise which of several plausible answers they have been handed, and the application’s screen gives them no means of doing so.</w:t>
+        <w:t xml:space="preserve">None of this can be cured by a temperature setting, since the chat interfaces expose none and provider-side non-determinism persists at temperature zero [12]. A design that took the variation seriously would run the analysis several times and show the spread, and would validate and pin one model rather than accept any. The advice that every suggested change be checked for plausibility before it is acted on [10] assumes a user who can recognise which of several plausible answers they hold, and the application’s screen gives them no means of doing so.</w:t>
       </w:r>
     </w:p>
     <w:p>

</xml_diff>

<commit_message>
Note the application's withdrawal from Google Play in both manuscripts, the cover letter and the article
Co-Authored-By: Claude Fable 5 <noreply@anthropic.com>
Claude-Session: https://claude.ai/code/session_01RLjJb3Wq5Q2cbr99Sz9XTW
</commit_message>
<xml_diff>
--- a/paper/STREET Manuscript 1.docx
+++ b/paper/STREET Manuscript 1.docx
@@ -197,7 +197,7 @@
         <w:spacing w:line="480" w:lineRule="auto"/>
       </w:pPr>
       <w:r>
-        <w:t xml:space="preserve">Each conversation was fresh, with the package attached to the first prompt and the remaining prompts sent in turn. No sampling parameters were set, so each provider’s default applied. Eleven models were run on 21 and 22 August 2026: Gemini 3.6 Flash, Gemini 3.1 Pro Preview and Gemini 3.5 Flash-Lite (Google, Mountain View, California, USA); GPT-5.6-sol and GPT-5.4-mini at the medium reasoning setting (OpenAI, San Francisco, California, USA); Claude Opus 5, Claude Sonnet 5 and Claude Haiku 4.5 (Anthropic, San Francisco, California, USA); DeepSeek V4 Pro (DeepSeek, Hangzhou, China); Grok 4.6 (xAI, Palo Alto, California, USA); and Llama 4 Maverick (Meta, Menlo Park, California, USA), the last three through OpenRouter (New York, New York, USA). Fifty conversations ran per model, 20 for Opus and Sonnet because of cost, and the served model identifier was recorded for every turn (Supplementary Table S1). Conversations ran through the providers’ programming interfaces, so the results describe the models rather than any chat product.</w:t>
+        <w:t xml:space="preserve">Each conversation was fresh, with the package attached to the first prompt and the remaining prompts sent in turn. No sampling parameters were set; each provider’s default applied. Eleven models were run on 21 and 22 August 2026: Gemini 3.6 Flash, Gemini 3.1 Pro Preview and Gemini 3.5 Flash-Lite (Google, Mountain View, California, USA); GPT-5.6-sol and GPT-5.4-mini at the medium reasoning setting (OpenAI, San Francisco, California, USA); Claude Opus 5, Claude Sonnet 5 and Claude Haiku 4.5 (Anthropic, San Francisco, California, USA); DeepSeek V4 Pro (DeepSeek, Hangzhou, China); Grok 4.6 (xAI, Palo Alto, California, USA); and Llama 4 Maverick (Meta, Menlo Park, California, USA), the last three through OpenRouter (New York, New York, USA). Fifty conversations ran per model, 20 for Opus and Sonnet because of cost, and the served model identifier was recorded for every turn (Supplementary Table S1). Conversations ran through the providers’ programming interfaces, so the results describe the models rather than any chat product.</w:t>
       </w:r>
     </w:p>
     <w:bookmarkEnd w:id="12"/>
@@ -217,7 +217,7 @@
         <w:spacing w:line="480" w:lineRule="auto"/>
       </w:pPr>
       <w:r>
-        <w:t xml:space="preserve">The application issues a repair prompt for three conditions: decision rows missing from or absent in the inventory, a current value not copied exactly, and a primary recommendation focus outside the five allowed words. It stops without a prompt when the paste is not valid JSON or a required string field is absent. It accepts everything else, including invalid enum words, missing sections and extra keys. The validator built from these observations reproduces the application’s verdict on all 25 informative test pastes (Supplementary Table S2), and it, rather than the application, judged the study’s responses. A repair prompt was sent once in the same conversation when needed, and each conversation was classified as accepted at first paste, accepted after repair, rejected with no prompt offered, or still rejected after repair; rules stated in the prompts but not enforced were recorded separately. Content analyses cover accepted conversations only, since the application holds nothing from a rejected one.</w:t>
+        <w:t xml:space="preserve">The application issues a repair prompt for three conditions: decision rows missing from or absent in the inventory, a current value not copied exactly, and a primary recommendation focus outside the five allowed words. It stops without a prompt when the paste is not valid JSON or a required string field is absent. It accepts everything else, including invalid enum words, missing sections and extra keys. The validator built from these observations reproduces the application’s verdict on all 25 informative test pastes (Supplementary Table S2), and it, rather than the application, judged the study’s responses. A repair prompt was sent once in the same conversation when needed, and each conversation was classified as accepted at first paste, accepted after repair, rejected with no prompt offered, or still rejected after repair; rules stated in the prompts but not enforced were recorded separately. Content analyses cover accepted conversations only; the application holds nothing from a rejected one.</w:t>
       </w:r>
     </w:p>
     <w:bookmarkEnd w:id="13"/>
@@ -268,7 +268,7 @@
         <w:spacing w:line="480" w:lineRule="auto"/>
       </w:pPr>
       <w:r>
-        <w:t xml:space="preserve">All 50 control-package conversations kept every setting unchanged; the remainder concerns the study record. The models quoted the record accurately (post hoc analysis): of the figures with a unit in accepted responses, 96.8 per cent (Opus) to 100 per cent (GPT-5.4-mini, Llama) were present in the package. Where a response changed a setting, the rationale cited at least one figure from the record in 85 to 100 per cent of changes for eight models, in 69 per cent for Gemini 3.1 Pro and in 5 per cent for Llama (Supplementary Table S3); no rationale quoted a figure that was absent from the record. Each model recognised that no carbohydrates had been logged in at least 70 per cent of its conversations (post hoc analysis). Only Llama changed a carbohydrate ratio; the others said the ratios could not be tested without meal data. The three models that acted on the safety limits cited the same arithmetic, a 25 U ceiling against 19.7 U of insulin a day, and both branches of the fork below cited the same figure, 18.5 per cent of readings below 70 mg/dl at 01:00. The 19.7 U is inherited: the package’s insulin total sums only the bolus and SMB records, it carries no basal delivery, and its scheduled basal adds 16.2 U a day (post hoc analysis; Supplementary Table S4). Flash took the bolus-only sum as the daily total in 49 of 50 conversations and lowered the limit in 48; GPT-5.4-mini, Haiku and Opus noted the omission in most of theirs; Opus reconstructed about 36 U a day in all 11.</w:t>
+        <w:t xml:space="preserve">All 50 control-package conversations kept every setting unchanged; the remainder concerns the study record. The models quoted the record accurately (post hoc analysis): of the figures with a unit in accepted responses, 96.8 per cent (Opus) to 100 per cent (GPT-5.4-mini, Llama) were present in the package. Where a response changed a setting, the rationale cited at least one figure from the record in 85 to 100 per cent of changes for eight models, in 69 per cent for Gemini 3.1 Pro and in 5 per cent for Llama (Supplementary Table S3); no rationale quoted a figure that was absent from the record. Each model recognised that no carbohydrates had been logged in at least 70 per cent of its conversations (post hoc analysis). Only Llama changed a carbohydrate ratio; the others said the ratios could not be tested without meal data. The three models that acted on the safety limits cited the same arithmetic, a 25 U ceiling against 19.7 U of insulin a day, and both branches of the fork below cited the same figure, 18.5 per cent of readings below 70 mg/dl at 01:00. The 19.7 U is inherited: the package’s insulin total sums only the bolus and SMB records, carries no basal delivery, and its scheduled basal adds 16.2 U a day (post hoc analysis; Supplementary Table S4). Flash took the bolus-only sum as the daily total in 49 of 50 conversations and lowered the limit in 48; GPT-5.4-mini, Haiku and Opus noted the omission in most of theirs; Opus reconstructed about 36 U a day in all 11.</w:t>
       </w:r>
     </w:p>
     <w:bookmarkEnd w:id="16"/>
@@ -315,7 +315,7 @@
         <w:t xml:space="preserve">“target”</w:t>
       </w:r>
       <w:r>
-        <w:t xml:space="preserve">; in the other 11 it left the targets alone, cut the midnight basal from 0.6 to 0.5 U/h and headed the result with</w:t>
+        <w:t xml:space="preserve">; in the other 11 it left the targets, cut the midnight basal from 0.6 to 0.5 U/h and led with</w:t>
       </w:r>
       <w:r>
         <w:t xml:space="preserve"> </w:t>
@@ -383,7 +383,7 @@
         <w:spacing w:line="480" w:lineRule="auto"/>
       </w:pPr>
       <w:r>
-        <w:t xml:space="preserve">Nothing in the preceding section was caught: the check accepted all 40 safety-limit pairs from the three models that lowered the limits, both branches of the Flash fork, both directions of the Llama basal change, all 14 DeepSeek sensitivity factors and each meal step marked completed on a record with no meals. Among accepted responses the proportion breaking a rule the prompts state but the check does not enforce ranged from none (GPT-5.6-sol) to 25 of 48 (GPT-5.4-mini) and 17 of 20 (Haiku), the commonest breaches being confidence words outside the allowed set, a missing issues section and extra keys, which reach the result screen.</w:t>
+        <w:t xml:space="preserve">Nothing in the preceding section was caught: the check accepted all 40 safety-limit pairs, both branches of the Flash fork, both directions of the Llama basal change, all 14 DeepSeek sensitivity factors and each meal step marked completed on a record with no meals. Among accepted responses the proportion breaking a rule the prompts state but the check does not enforce ranged from none (GPT-5.6-sol) to 25 of 48 (GPT-5.4-mini) and 17 of 20 (Haiku), the commonest breaches being confidence words outside the allowed set, a missing issues section and extra keys, which reach the result screen.</w:t>
       </w:r>
     </w:p>
     <w:bookmarkEnd w:id="18"/>
@@ -404,7 +404,7 @@
         <w:spacing w:line="480" w:lineRule="auto"/>
       </w:pPr>
       <w:r>
-        <w:t xml:space="preserve">On this record the review a user received depended more on which model they opened than on the data, and the application could not tell the difference. The models did not agree about what followed from the record: four models left the limits alone, three lowered them, one proposed sensitivity factors ranging over a factor of six, and one raised a basal rate that another lowered. Within a single model the direction held and the number did not. The overnight lows show the difference at its clearest: the same figure led two models to leave the overnight settings alone because earlier insulin explained it, two to raise the target as a cushion against it, and one to change the basal without offering a cause; only the first acts on what the record shows. Each answer was internally coherent and presented in the same form, so nothing on the screen tells the user which they have been given.</w:t>
+        <w:t xml:space="preserve">On this record the review a user received depended more on which model they opened than on the data, and the application could not tell the difference. The models did not agree about what followed from the record: four models left the limits alone, three lowered them, one proposed sensitivity factors ranging over a factor of six, and one raised a basal rate that another lowered. Within a single model the direction held and the number did not. The overnight lows show the difference at its clearest: the same figure led two models to leave the overnight settings alone because earlier insulin explained it, two to raise the target as a cushion against it, and one to change the basal without offering a cause; only the first acts on what the record shows. Each answer was internally coherent and presented in the same form; nothing on the screen tells the user which they hold.</w:t>
       </w:r>
     </w:p>
     <w:p>
@@ -413,7 +413,7 @@
         <w:spacing w:line="480" w:lineRule="auto"/>
       </w:pPr>
       <w:r>
-        <w:t xml:space="preserve">This is a different failure from the two seen with raw five-minute data, where settings anchored on training priors and cited readings were unreliable [9]. The package here carried the current profile and the check enforced the copying of current values, the two safeguards that paper proposed. The misquotation did not recur, and for eight of the eleven models nearly every change was argued from a figure in the record, for Gemini 3.1 Pro two thirds were; Llama changed settings without citing one, and DeepSeek’s shortening of the DIA has the shape of the textbook anchoring seen before. The comparison is between two studies with different records, prompts and models, so it shows the earlier failures largely absent here, not that the package removed them. The package also fixes what the models do not see: its insulin total omits basal delivery, and the model that cut the safety limits most often was the one that mistook the bolus-only sum for the whole. The models that read the total correctly did so from training, since knowing that an AID system delivers basal insulin is not in the package; the priors the earlier study treated as anchoring are also a model’s means of questioning the data, and whether a draw applies them is itself sampled. Two smaller splits have the same shape: the hourly glucose is keyed in both UTC and local time, and 30 conversations placed the low band at the wrong clock hour; the diluted insulin is disclosed only in a profile name string, which 90 conversations noticed (Supplementary Table S5). What the models argued from the record was not stable: with good evidence they generate several plausible conclusions and the sampling decides which is shown. A structured package appears to fix what the model reads and to leave untouched what it decides, and the product sells the decision.</w:t>
+        <w:t xml:space="preserve">This is a different failure from the two seen with raw five-minute data, where settings anchored on training priors and cited readings were unreliable [9]. The package here carried the current profile and the check enforced the copying of current values, the two safeguards that paper proposed. The misquotation did not recur, and for eight of the eleven models nearly every change was argued from a figure in the record, for Gemini 3.1 Pro two thirds were; Llama changed settings without citing one, and DeepSeek’s shortening of the DIA has the shape of the textbook anchoring seen before. The comparison is between two studies with different records, prompts and models, so it shows the earlier failures largely absent, not that the package removed them. The package also fixes what the models do not see: its insulin total omits basal delivery, and the model that cut the safety limits most often was the one that mistook the bolus-only sum for the whole. The models that read the total correctly did so from training, since knowing that an AID system delivers basal insulin is not in the package; the priors the earlier study treated as anchoring are also a model’s means of questioning the data, and whether a draw applies them is itself sampled. Two smaller splits have the same shape: the hourly glucose is keyed in both UTC and local time, and 30 conversations placed the low band at the wrong clock hour; the diluted insulin is disclosed only in a profile name string, which 90 conversations noticed (Supplementary Table S5). What the models argued from the record was not stable: with good evidence they generate several plausible conclusions and the sampling decides which is shown. A structured package appears to fix what the model reads and to leave untouched what it decides, and the product sells the decision.</w:t>
       </w:r>
     </w:p>
     <w:p>
@@ -422,7 +422,7 @@
         <w:spacing w:line="480" w:lineRule="auto"/>
       </w:pPr>
       <w:r>
-        <w:t xml:space="preserve">The application’s check is a check of form, enforcing the identity of the decision table, the copying of current values and one enumerated field. It does not inspect a proposed value, a status, a confidence word or the content of a recommendation, so a meal step marked completed on a record with no meals appears as the model wrote it, and an ISF of 180 mg/dl per unit passes as readily as one of 56. The prompts contain rules against most of this, but they are instructions to the model rather than checks, and the cheaper models broke them in a quarter to four fifths of accepted responses.</w:t>
+        <w:t xml:space="preserve">The application’s check is a check of form: the identity of the decision table, the copying of current values and one enumerated field. It does not inspect a proposed value, a status, a confidence word or the content of a recommendation, so a meal step marked completed on a record with no meals appears as the model wrote it, and an ISF of 180 mg/dl per unit passes as readily as one of 56. The prompts contain rules against most of this, but they are instructions to the model rather than checks, and the cheaper models broke them in a quarter to four fifths of accepted responses.</w:t>
       </w:r>
     </w:p>
     <w:p>
@@ -431,7 +431,7 @@
         <w:spacing w:line="480" w:lineRule="auto"/>
       </w:pPr>
       <w:r>
-        <w:t xml:space="preserve">None of this can be cured by a temperature setting, since the chat interfaces expose none and provider-side non-determinism persists at temperature zero [12]. A design that took the variation seriously would run the analysis several times and show the spread, and would validate and pin one model rather than accept any. The advice that every suggested change be checked for plausibility before it is acted on [10] assumes a user who can recognise which of several plausible answers they hold, and the application’s screen gives them no means of doing so.</w:t>
+        <w:t xml:space="preserve">None of this is cured by a temperature setting: the chat interfaces expose none, and non-determinism persists at temperature zero [12]. A design that took the variation seriously would run the analysis several times, show the spread, and validate and pin one model rather than accept any. The advice that every suggested change be checked for plausibility before it is acted on [10] assumes a user who can recognise which of several plausible answers they hold, and the application’s screen gives them no means of doing so.</w:t>
       </w:r>
     </w:p>
     <w:p>
@@ -440,7 +440,7 @@
         <w:spacing w:line="480" w:lineRule="auto"/>
       </w:pPr>
       <w:r>
-        <w:t xml:space="preserve">A profile with different problems might be treated differently. The validator reproduces the application’s behaviour on 25 informative tests but could differ on cases not tested. The study measured consistency, not correctness: there is no reference answer for these settings and no counterfactual glucose trajectory for any proposed change, so what is reported is what the models produced, not what would have happened had a user acted on it. The safety concern is therefore epistemic rather than a claim that any particular answer was mistaken.</w:t>
+        <w:t xml:space="preserve">A profile with different problems might be treated differently. The application was withdrawn from Google Play after these findings were published in late August 2026, a sequence the developer confirmed to the author (personal communication); the analysis describes the product as sold. The validator reproduces the application’s behaviour on 25 informative tests but could differ on untested cases. The study measured consistency, not correctness: there is no reference answer for these settings and no counterfactual glucose trajectory for any change, so what is reported is what the models produced, not what would have followed had a user acted. The safety concern is therefore epistemic rather than a claim that any particular answer was mistaken.</w:t>
       </w:r>
     </w:p>
     <w:bookmarkEnd w:id="20"/>
@@ -615,7 +615,7 @@
         <w:spacing w:line="480" w:lineRule="auto"/>
       </w:pPr>
       <w:r>
-        <w:t xml:space="preserve">Kowalczyk A. TuneMyBG. Google Play. Version 1.0.5, updated 20 August 2026. https://play.google.com/store/apps/details?id=com.adamkowalczyk.tunemybg. Accessed 22 August 2026.</w:t>
+        <w:t xml:space="preserve">Kowalczyk A. TuneMyBG. Google Play. Version 1.0.5, updated 20 August 2026. https://play.google.com/store/apps/details?id=com.adamkowalczyk.tunemybg. Accessed 22 August 2026; listing removed by 24 August 2026.</w:t>
       </w:r>
     </w:p>
     <w:p>

</xml_diff>

<commit_message>
Manuscript under the limit; preprints rebuilt with the withdrawal note
Co-Authored-By: Claude Fable 5 <noreply@anthropic.com>
Claude-Session: https://claude.ai/code/session_01RLjJb3Wq5Q2cbr99Sz9XTW
</commit_message>
<xml_diff>
--- a/paper/STREET Manuscript 1.docx
+++ b/paper/STREET Manuscript 1.docx
@@ -168,7 +168,7 @@
         <w:spacing w:line="480" w:lineRule="auto"/>
       </w:pPr>
       <w:r>
-        <w:t xml:space="preserve">The application studied was TuneMyBG, version 1.0.5 (Adam Kowalczyk, Lubliniec, Poland; distributed through Google Play) [4]; the package and the four prompts were copied verbatim from it. The application’s source is not available, so its repair prompt and acceptance behaviour were established by pasting 25 real model outputs into the result screen. The application’s synthetic demonstration package served as a control. The study package came from the author’s own Nightscout instance and AndroidAPS profile: 14 days of CGM data, mean glucose 121.6 mg/dl, time in range 86.0 per cent, time below 70 mg/dl (3.9 mmol/L [11]) 5.1 per cent, 275.95 units of bolus and SMB insulin in its treatment records, and no carbohydrate entries, since the author does not log meals. The profile had a single ISF of 56 mg/dl per unit, overnight targets of 90 mg/dl, a DIA of 10 hours, a maximum basal of 12 U/h and a maximum insulin on board (IOB) of 25 U. Time below 70 mg/dl peaks at 18.5 per cent at 01:00 local time and has fallen to low single figures by 04:00 with the same basal segment running, which under a 10-hour DIA is more consistent with the tail of evening insulin than with the overnight basal or target; the reading is the author’s interpretation.</w:t>
+        <w:t xml:space="preserve">The application studied was TuneMyBG, version 1.0.5 (Adam Kowalczyk, Lubliniec, Poland; distributed through Google Play) [4]; the package and the four prompts were copied verbatim from it. The application’s source is not available, so its repair prompt and acceptance behaviour were established by pasting 25 real model outputs into the result screen. The application’s synthetic demonstration package served as a control. The study package came from the author’s own Nightscout instance and AndroidAPS profile: 14 days of CGM data, mean glucose 121.6 mg/dl, time in range 86.0 per cent, time below 70 mg/dl (3.9 mmol/L [11]) 5.1 per cent, 275.95 units of bolus and SMB insulin in its treatment records, and no carbohydrate entries, since the author does not log meals. The profile had a single ISF of 56 mg/dl per unit, overnight targets of 90 mg/dl, a DIA of 10 hours, a maximum basal of 12 U/h and a maximum insulin on board (IOB) of 25 U. Time below 70 mg/dl peaks at 18.5 per cent at 01:00 local time and has fallen to low single figures by 04:00 under the same basal segment, which under a 10-hour DIA is more consistent with the tail of evening insulin than with the overnight basal or target; the reading is the author’s interpretation.</w:t>
       </w:r>
     </w:p>
     <w:p>
@@ -177,7 +177,7 @@
         <w:spacing w:line="480" w:lineRule="auto"/>
       </w:pPr>
       <w:r>
-        <w:t xml:space="preserve">One record was used by design. The question is whether the same input yields the same review, and holding the input fixed while the conversation is repeated attributes all observed variation to the model and the application. A study of whether the advice is correct would need many records and a reference standard, and is a different study. The data are the author’s own, published with his written consent; no other person’s data were involved and no institutional review board approval was sought. No change was made to any treatment.</w:t>
+        <w:t xml:space="preserve">One record was used by design. The question is whether the same input yields the same review; holding the input fixed attributes all observed variation to the model and the application. A study of whether the advice is correct would need many records and a reference standard, and is a different study. The data are the author’s own, published with his written consent; no other person’s data were involved and no institutional review board approval was sought. No change was made to any treatment.</w:t>
       </w:r>
     </w:p>
     <w:bookmarkEnd w:id="11"/>

</xml_diff>